<commit_message>
style: loosen report layout within the 4-page limit
The draft occupied only three of the four permitted pages, so the compressed settings used while drafting were unnecessary. Margins 1.6 to 2.0 cm, table text 8.5 to 9.5 pt, captions 8 to 9 pt, paragraph spacing 4 to 6 pt; body text stays 10 pt Calibri single-spaced as the brief requires. Tables and figures rescaled to the narrower 17.0 cm text width.
</commit_message>
<xml_diff>
--- a/report/HIT140_A3_Group26_report.docx
+++ b/report/HIT140_A3_Group26_report.docx
@@ -138,7 +138,7 @@
       <w:tr>
         <w:tc>
           <w:tcPr>
-            <w:tcW w:type="dxa" w:w="2381"/>
+            <w:tcW w:type="dxa" w:w="2324"/>
           </w:tcPr>
           <w:p>
             <w:pPr>
@@ -148,7 +148,7 @@
             <w:r>
               <w:rPr>
                 <w:b/>
-                <w:sz w:val="17"/>
+                <w:sz w:val="19"/>
               </w:rPr>
               <w:t>Concept</w:t>
             </w:r>
@@ -156,7 +156,7 @@
         </w:tc>
         <w:tc>
           <w:tcPr>
-            <w:tcW w:type="dxa" w:w="3742"/>
+            <w:tcW w:type="dxa" w:w="3657"/>
           </w:tcPr>
           <w:p>
             <w:pPr>
@@ -166,7 +166,7 @@
             <w:r>
               <w:rPr>
                 <w:b/>
-                <w:sz w:val="17"/>
+                <w:sz w:val="19"/>
               </w:rPr>
               <w:t>Model 2.1 (104 rows, all team1 − team2)</w:t>
             </w:r>
@@ -174,7 +174,7 @@
         </w:tc>
         <w:tc>
           <w:tcPr>
-            <w:tcW w:type="dxa" w:w="3742"/>
+            <w:tcW w:type="dxa" w:w="3657"/>
           </w:tcPr>
           <w:p>
             <w:pPr>
@@ -184,7 +184,7 @@
             <w:r>
               <w:rPr>
                 <w:b/>
-                <w:sz w:val="17"/>
+                <w:sz w:val="19"/>
               </w:rPr>
               <w:t>Model 2.2 (208 rows)</w:t>
             </w:r>
@@ -194,7 +194,7 @@
       <w:tr>
         <w:tc>
           <w:tcPr>
-            <w:tcW w:type="dxa" w:w="2381"/>
+            <w:tcW w:type="dxa" w:w="2324"/>
           </w:tcPr>
           <w:p>
             <w:pPr>
@@ -203,7 +203,7 @@
             <w:r/>
             <w:r>
               <w:rPr>
-                <w:sz w:val="17"/>
+                <w:sz w:val="19"/>
               </w:rPr>
               <w:t>FIFA ranking *</w:t>
             </w:r>
@@ -211,7 +211,7 @@
         </w:tc>
         <w:tc>
           <w:tcPr>
-            <w:tcW w:type="dxa" w:w="3742"/>
+            <w:tcW w:type="dxa" w:w="3657"/>
           </w:tcPr>
           <w:p>
             <w:pPr>
@@ -220,7 +220,7 @@
             <w:r/>
             <w:r>
               <w:rPr>
-                <w:sz w:val="17"/>
+                <w:sz w:val="19"/>
               </w:rPr>
               <w:t>log_rank_diff</w:t>
             </w:r>
@@ -228,7 +228,7 @@
         </w:tc>
         <w:tc>
           <w:tcPr>
-            <w:tcW w:type="dxa" w:w="3742"/>
+            <w:tcW w:type="dxa" w:w="3657"/>
           </w:tcPr>
           <w:p>
             <w:pPr>
@@ -237,7 +237,7 @@
             <w:r/>
             <w:r>
               <w:rPr>
-                <w:sz w:val="17"/>
+                <w:sz w:val="19"/>
               </w:rPr>
               <w:t>team_log_rank, opp_log_rank</w:t>
             </w:r>
@@ -247,7 +247,7 @@
       <w:tr>
         <w:tc>
           <w:tcPr>
-            <w:tcW w:type="dxa" w:w="2381"/>
+            <w:tcW w:type="dxa" w:w="2324"/>
           </w:tcPr>
           <w:p>
             <w:pPr>
@@ -256,7 +256,7 @@
             <w:r/>
             <w:r>
               <w:rPr>
-                <w:sz w:val="17"/>
+                <w:sz w:val="19"/>
               </w:rPr>
               <w:t>Squad value *</w:t>
             </w:r>
@@ -264,7 +264,7 @@
         </w:tc>
         <w:tc>
           <w:tcPr>
-            <w:tcW w:type="dxa" w:w="3742"/>
+            <w:tcW w:type="dxa" w:w="3657"/>
           </w:tcPr>
           <w:p>
             <w:pPr>
@@ -273,7 +273,7 @@
             <w:r/>
             <w:r>
               <w:rPr>
-                <w:sz w:val="17"/>
+                <w:sz w:val="19"/>
               </w:rPr>
               <w:t>log_value_diff</w:t>
             </w:r>
@@ -281,7 +281,7 @@
         </w:tc>
         <w:tc>
           <w:tcPr>
-            <w:tcW w:type="dxa" w:w="3742"/>
+            <w:tcW w:type="dxa" w:w="3657"/>
           </w:tcPr>
           <w:p>
             <w:pPr>
@@ -290,7 +290,7 @@
             <w:r/>
             <w:r>
               <w:rPr>
-                <w:sz w:val="17"/>
+                <w:sz w:val="19"/>
               </w:rPr>
               <w:t>team_log_value</w:t>
             </w:r>
@@ -300,7 +300,7 @@
       <w:tr>
         <w:tc>
           <w:tcPr>
-            <w:tcW w:type="dxa" w:w="2381"/>
+            <w:tcW w:type="dxa" w:w="2324"/>
           </w:tcPr>
           <w:p>
             <w:pPr>
@@ -309,7 +309,7 @@
             <w:r/>
             <w:r>
               <w:rPr>
-                <w:sz w:val="17"/>
+                <w:sz w:val="19"/>
               </w:rPr>
               <w:t>Host at home *</w:t>
             </w:r>
@@ -317,7 +317,7 @@
         </w:tc>
         <w:tc>
           <w:tcPr>
-            <w:tcW w:type="dxa" w:w="3742"/>
+            <w:tcW w:type="dxa" w:w="3657"/>
           </w:tcPr>
           <w:p>
             <w:pPr>
@@ -326,7 +326,7 @@
             <w:r/>
             <w:r>
               <w:rPr>
-                <w:sz w:val="17"/>
+                <w:sz w:val="19"/>
               </w:rPr>
               <w:t>host_home_diff</w:t>
             </w:r>
@@ -334,7 +334,7 @@
         </w:tc>
         <w:tc>
           <w:tcPr>
-            <w:tcW w:type="dxa" w:w="3742"/>
+            <w:tcW w:type="dxa" w:w="3657"/>
           </w:tcPr>
           <w:p>
             <w:pPr>
@@ -343,7 +343,7 @@
             <w:r/>
             <w:r>
               <w:rPr>
-                <w:sz w:val="17"/>
+                <w:sz w:val="19"/>
               </w:rPr>
               <w:t>is_host_home</w:t>
             </w:r>
@@ -353,7 +353,7 @@
       <w:tr>
         <w:tc>
           <w:tcPr>
-            <w:tcW w:type="dxa" w:w="2381"/>
+            <w:tcW w:type="dxa" w:w="2324"/>
           </w:tcPr>
           <w:p>
             <w:pPr>
@@ -362,7 +362,7 @@
             <w:r/>
             <w:r>
               <w:rPr>
-                <w:sz w:val="17"/>
+                <w:sz w:val="19"/>
               </w:rPr>
               <w:t>Stage *</w:t>
             </w:r>
@@ -370,7 +370,7 @@
         </w:tc>
         <w:tc>
           <w:tcPr>
-            <w:tcW w:type="dxa" w:w="3742"/>
+            <w:tcW w:type="dxa" w:w="3657"/>
           </w:tcPr>
           <w:p>
             <w:pPr>
@@ -379,7 +379,7 @@
             <w:r/>
             <w:r>
               <w:rPr>
-                <w:sz w:val="17"/>
+                <w:sz w:val="19"/>
               </w:rPr>
               <w:t>stage_ord</w:t>
             </w:r>
@@ -387,7 +387,7 @@
         </w:tc>
         <w:tc>
           <w:tcPr>
-            <w:tcW w:type="dxa" w:w="3742"/>
+            <w:tcW w:type="dxa" w:w="3657"/>
           </w:tcPr>
           <w:p>
             <w:pPr>
@@ -396,7 +396,7 @@
             <w:r/>
             <w:r>
               <w:rPr>
-                <w:sz w:val="17"/>
+                <w:sz w:val="19"/>
               </w:rPr>
               <w:t>is_knockout</w:t>
             </w:r>
@@ -406,7 +406,7 @@
       <w:tr>
         <w:tc>
           <w:tcPr>
-            <w:tcW w:type="dxa" w:w="2381"/>
+            <w:tcW w:type="dxa" w:w="2324"/>
           </w:tcPr>
           <w:p>
             <w:pPr>
@@ -415,7 +415,7 @@
             <w:r/>
             <w:r>
               <w:rPr>
-                <w:sz w:val="17"/>
+                <w:sz w:val="19"/>
               </w:rPr>
               <w:t>Form — points</w:t>
             </w:r>
@@ -423,7 +423,7 @@
         </w:tc>
         <w:tc>
           <w:tcPr>
-            <w:tcW w:type="dxa" w:w="3742"/>
+            <w:tcW w:type="dxa" w:w="3657"/>
           </w:tcPr>
           <w:p>
             <w:pPr>
@@ -432,7 +432,7 @@
             <w:r/>
             <w:r>
               <w:rPr>
-                <w:sz w:val="17"/>
+                <w:sz w:val="19"/>
               </w:rPr>
               <w:t>ppg_diff</w:t>
             </w:r>
@@ -440,7 +440,7 @@
         </w:tc>
         <w:tc>
           <w:tcPr>
-            <w:tcW w:type="dxa" w:w="3742"/>
+            <w:tcW w:type="dxa" w:w="3657"/>
           </w:tcPr>
           <w:p>
             <w:pPr>
@@ -449,7 +449,7 @@
             <w:r/>
             <w:r>
               <w:rPr>
-                <w:sz w:val="17"/>
+                <w:sz w:val="19"/>
               </w:rPr>
               <w:t>—</w:t>
             </w:r>
@@ -459,7 +459,7 @@
       <w:tr>
         <w:tc>
           <w:tcPr>
-            <w:tcW w:type="dxa" w:w="2381"/>
+            <w:tcW w:type="dxa" w:w="2324"/>
           </w:tcPr>
           <w:p>
             <w:pPr>
@@ -468,7 +468,7 @@
             <w:r/>
             <w:r>
               <w:rPr>
-                <w:sz w:val="17"/>
+                <w:sz w:val="19"/>
               </w:rPr>
               <w:t>Form — goal difference</w:t>
             </w:r>
@@ -476,7 +476,7 @@
         </w:tc>
         <w:tc>
           <w:tcPr>
-            <w:tcW w:type="dxa" w:w="3742"/>
+            <w:tcW w:type="dxa" w:w="3657"/>
           </w:tcPr>
           <w:p>
             <w:pPr>
@@ -485,7 +485,7 @@
             <w:r/>
             <w:r>
               <w:rPr>
-                <w:sz w:val="17"/>
+                <w:sz w:val="19"/>
               </w:rPr>
               <w:t>gd_pg_diff</w:t>
             </w:r>
@@ -493,7 +493,7 @@
         </w:tc>
         <w:tc>
           <w:tcPr>
-            <w:tcW w:type="dxa" w:w="3742"/>
+            <w:tcW w:type="dxa" w:w="3657"/>
           </w:tcPr>
           <w:p>
             <w:pPr>
@@ -502,7 +502,7 @@
             <w:r/>
             <w:r>
               <w:rPr>
-                <w:sz w:val="17"/>
+                <w:sz w:val="19"/>
               </w:rPr>
               <w:t>—</w:t>
             </w:r>
@@ -512,7 +512,7 @@
       <w:tr>
         <w:tc>
           <w:tcPr>
-            <w:tcW w:type="dxa" w:w="2381"/>
+            <w:tcW w:type="dxa" w:w="2324"/>
           </w:tcPr>
           <w:p>
             <w:pPr>
@@ -521,7 +521,7 @@
             <w:r/>
             <w:r>
               <w:rPr>
-                <w:sz w:val="17"/>
+                <w:sz w:val="19"/>
               </w:rPr>
               <w:t>Rest days</w:t>
             </w:r>
@@ -529,7 +529,7 @@
         </w:tc>
         <w:tc>
           <w:tcPr>
-            <w:tcW w:type="dxa" w:w="3742"/>
+            <w:tcW w:type="dxa" w:w="3657"/>
           </w:tcPr>
           <w:p>
             <w:pPr>
@@ -538,7 +538,7 @@
             <w:r/>
             <w:r>
               <w:rPr>
-                <w:sz w:val="17"/>
+                <w:sz w:val="19"/>
               </w:rPr>
               <w:t>rest_days_diff</w:t>
             </w:r>
@@ -546,7 +546,7 @@
         </w:tc>
         <w:tc>
           <w:tcPr>
-            <w:tcW w:type="dxa" w:w="3742"/>
+            <w:tcW w:type="dxa" w:w="3657"/>
           </w:tcPr>
           <w:p>
             <w:pPr>
@@ -555,7 +555,7 @@
             <w:r/>
             <w:r>
               <w:rPr>
-                <w:sz w:val="17"/>
+                <w:sz w:val="19"/>
               </w:rPr>
               <w:t>—</w:t>
             </w:r>
@@ -565,7 +565,7 @@
       <w:tr>
         <w:tc>
           <w:tcPr>
-            <w:tcW w:type="dxa" w:w="2381"/>
+            <w:tcW w:type="dxa" w:w="2324"/>
           </w:tcPr>
           <w:p>
             <w:pPr>
@@ -574,7 +574,7 @@
             <w:r/>
             <w:r>
               <w:rPr>
-                <w:sz w:val="17"/>
+                <w:sz w:val="19"/>
               </w:rPr>
               <w:t>Confederation</w:t>
             </w:r>
@@ -582,7 +582,7 @@
         </w:tc>
         <w:tc>
           <w:tcPr>
-            <w:tcW w:type="dxa" w:w="3742"/>
+            <w:tcW w:type="dxa" w:w="3657"/>
           </w:tcPr>
           <w:p>
             <w:pPr>
@@ -591,7 +591,7 @@
             <w:r/>
             <w:r>
               <w:rPr>
-                <w:sz w:val="17"/>
+                <w:sz w:val="19"/>
               </w:rPr>
               <w:t>same_confed</w:t>
             </w:r>
@@ -599,7 +599,7 @@
         </w:tc>
         <w:tc>
           <w:tcPr>
-            <w:tcW w:type="dxa" w:w="3742"/>
+            <w:tcW w:type="dxa" w:w="3657"/>
           </w:tcPr>
           <w:p>
             <w:pPr>
@@ -608,7 +608,7 @@
             <w:r/>
             <w:r>
               <w:rPr>
-                <w:sz w:val="17"/>
+                <w:sz w:val="19"/>
               </w:rPr>
               <w:t>—</w:t>
             </w:r>
@@ -618,7 +618,7 @@
       <w:tr>
         <w:tc>
           <w:tcPr>
-            <w:tcW w:type="dxa" w:w="2381"/>
+            <w:tcW w:type="dxa" w:w="2324"/>
           </w:tcPr>
           <w:p>
             <w:pPr>
@@ -627,7 +627,7 @@
             <w:r/>
             <w:r>
               <w:rPr>
-                <w:sz w:val="17"/>
+                <w:sz w:val="19"/>
               </w:rPr>
               <w:t>Form — goals for</w:t>
             </w:r>
@@ -635,7 +635,7 @@
         </w:tc>
         <w:tc>
           <w:tcPr>
-            <w:tcW w:type="dxa" w:w="3742"/>
+            <w:tcW w:type="dxa" w:w="3657"/>
           </w:tcPr>
           <w:p>
             <w:pPr>
@@ -644,7 +644,7 @@
             <w:r/>
             <w:r>
               <w:rPr>
-                <w:sz w:val="17"/>
+                <w:sz w:val="19"/>
               </w:rPr>
               <w:t>—</w:t>
             </w:r>
@@ -652,7 +652,7 @@
         </w:tc>
         <w:tc>
           <w:tcPr>
-            <w:tcW w:type="dxa" w:w="3742"/>
+            <w:tcW w:type="dxa" w:w="3657"/>
           </w:tcPr>
           <w:p>
             <w:pPr>
@@ -661,7 +661,7 @@
             <w:r/>
             <w:r>
               <w:rPr>
-                <w:sz w:val="17"/>
+                <w:sz w:val="19"/>
               </w:rPr>
               <w:t>team_gf_pg</w:t>
             </w:r>
@@ -671,7 +671,7 @@
       <w:tr>
         <w:tc>
           <w:tcPr>
-            <w:tcW w:type="dxa" w:w="2381"/>
+            <w:tcW w:type="dxa" w:w="2324"/>
           </w:tcPr>
           <w:p>
             <w:pPr>
@@ -680,7 +680,7 @@
             <w:r/>
             <w:r>
               <w:rPr>
-                <w:sz w:val="17"/>
+                <w:sz w:val="19"/>
               </w:rPr>
               <w:t>Form — goals against</w:t>
             </w:r>
@@ -688,7 +688,7 @@
         </w:tc>
         <w:tc>
           <w:tcPr>
-            <w:tcW w:type="dxa" w:w="3742"/>
+            <w:tcW w:type="dxa" w:w="3657"/>
           </w:tcPr>
           <w:p>
             <w:pPr>
@@ -697,7 +697,7 @@
             <w:r/>
             <w:r>
               <w:rPr>
-                <w:sz w:val="17"/>
+                <w:sz w:val="19"/>
               </w:rPr>
               <w:t>—</w:t>
             </w:r>
@@ -705,7 +705,7 @@
         </w:tc>
         <w:tc>
           <w:tcPr>
-            <w:tcW w:type="dxa" w:w="3742"/>
+            <w:tcW w:type="dxa" w:w="3657"/>
           </w:tcPr>
           <w:p>
             <w:pPr>
@@ -714,7 +714,7 @@
             <w:r/>
             <w:r>
               <w:rPr>
-                <w:sz w:val="17"/>
+                <w:sz w:val="19"/>
               </w:rPr>
               <w:t>opp_ga_pg</w:t>
             </w:r>
@@ -724,7 +724,7 @@
       <w:tr>
         <w:tc>
           <w:tcPr>
-            <w:tcW w:type="dxa" w:w="2381"/>
+            <w:tcW w:type="dxa" w:w="2324"/>
           </w:tcPr>
           <w:p>
             <w:pPr>
@@ -733,7 +733,7 @@
             <w:r/>
             <w:r>
               <w:rPr>
-                <w:sz w:val="17"/>
+                <w:sz w:val="19"/>
               </w:rPr>
               <w:t>Form — opponent goals for</w:t>
             </w:r>
@@ -741,7 +741,7 @@
         </w:tc>
         <w:tc>
           <w:tcPr>
-            <w:tcW w:type="dxa" w:w="3742"/>
+            <w:tcW w:type="dxa" w:w="3657"/>
           </w:tcPr>
           <w:p>
             <w:pPr>
@@ -750,7 +750,7 @@
             <w:r/>
             <w:r>
               <w:rPr>
-                <w:sz w:val="17"/>
+                <w:sz w:val="19"/>
               </w:rPr>
               <w:t>—</w:t>
             </w:r>
@@ -758,7 +758,7 @@
         </w:tc>
         <w:tc>
           <w:tcPr>
-            <w:tcW w:type="dxa" w:w="3742"/>
+            <w:tcW w:type="dxa" w:w="3657"/>
           </w:tcPr>
           <w:p>
             <w:pPr>
@@ -767,7 +767,7 @@
             <w:r/>
             <w:r>
               <w:rPr>
-                <w:sz w:val="17"/>
+                <w:sz w:val="19"/>
               </w:rPr>
               <w:t>opp_gf_pg</w:t>
             </w:r>
@@ -782,7 +782,7 @@
       <w:r>
         <w:rPr>
           <w:i/>
-          <w:sz w:val="16"/>
+          <w:sz w:val="18"/>
         </w:rPr>
         <w:t>Table 1. The eight explanatory variables of each model. Four concepts marked * are shared between the two models, which is the maximum the brief allows; no column name is identical, because model 2.1 expresses each as a team1-minus-team2 difference while model 2.2 uses levels for the team and its opponent.</w:t>
       </w:r>
@@ -873,7 +873,7 @@
             <w:r>
               <w:rPr>
                 <w:b/>
-                <w:sz w:val="17"/>
+                <w:sz w:val="19"/>
               </w:rPr>
               <w:t>Model</w:t>
             </w:r>
@@ -891,7 +891,7 @@
             <w:r>
               <w:rPr>
                 <w:b/>
-                <w:sz w:val="17"/>
+                <w:sz w:val="19"/>
               </w:rPr>
               <w:t>Terms</w:t>
             </w:r>
@@ -909,7 +909,7 @@
             <w:r>
               <w:rPr>
                 <w:b/>
-                <w:sz w:val="17"/>
+                <w:sz w:val="19"/>
               </w:rPr>
               <w:t>CV RMSE</w:t>
             </w:r>
@@ -927,7 +927,7 @@
             <w:r>
               <w:rPr>
                 <w:b/>
-                <w:sz w:val="17"/>
+                <w:sz w:val="19"/>
               </w:rPr>
               <w:t>Walk-forward RMSE</w:t>
             </w:r>
@@ -945,7 +945,7 @@
             <w:r>
               <w:rPr>
                 <w:b/>
-                <w:sz w:val="17"/>
+                <w:sz w:val="19"/>
               </w:rPr>
               <w:t>Hold-out RMSE</w:t>
             </w:r>
@@ -964,7 +964,7 @@
             <w:r/>
             <w:r>
               <w:rPr>
-                <w:sz w:val="17"/>
+                <w:sz w:val="19"/>
               </w:rPr>
               <w:t>Mean baseline</w:t>
             </w:r>
@@ -981,7 +981,7 @@
             <w:r/>
             <w:r>
               <w:rPr>
-                <w:sz w:val="17"/>
+                <w:sz w:val="19"/>
               </w:rPr>
               <w:t>0</w:t>
             </w:r>
@@ -998,7 +998,7 @@
             <w:r/>
             <w:r>
               <w:rPr>
-                <w:sz w:val="17"/>
+                <w:sz w:val="19"/>
               </w:rPr>
               <w:t>2.03</w:t>
             </w:r>
@@ -1015,7 +1015,7 @@
             <w:r/>
             <w:r>
               <w:rPr>
-                <w:sz w:val="17"/>
+                <w:sz w:val="19"/>
               </w:rPr>
               <w:t>2.10</w:t>
             </w:r>
@@ -1032,7 +1032,7 @@
             <w:r/>
             <w:r>
               <w:rPr>
-                <w:sz w:val="17"/>
+                <w:sz w:val="19"/>
               </w:rPr>
               <w:t>1.97</w:t>
             </w:r>
@@ -1051,7 +1051,7 @@
             <w:r/>
             <w:r>
               <w:rPr>
-                <w:sz w:val="17"/>
+                <w:sz w:val="19"/>
               </w:rPr>
               <w:t>Full OLS, eight variables</w:t>
             </w:r>
@@ -1068,7 +1068,7 @@
             <w:r/>
             <w:r>
               <w:rPr>
-                <w:sz w:val="17"/>
+                <w:sz w:val="19"/>
               </w:rPr>
               <w:t>8</w:t>
             </w:r>
@@ -1085,7 +1085,7 @@
             <w:r/>
             <w:r>
               <w:rPr>
-                <w:sz w:val="17"/>
+                <w:sz w:val="19"/>
               </w:rPr>
               <w:t>1.55</w:t>
             </w:r>
@@ -1102,7 +1102,7 @@
             <w:r/>
             <w:r>
               <w:rPr>
-                <w:sz w:val="17"/>
+                <w:sz w:val="19"/>
               </w:rPr>
               <w:t>1.82</w:t>
             </w:r>
@@ -1119,7 +1119,7 @@
             <w:r/>
             <w:r>
               <w:rPr>
-                <w:sz w:val="17"/>
+                <w:sz w:val="19"/>
               </w:rPr>
               <w:t>1.91</w:t>
             </w:r>
@@ -1138,7 +1138,7 @@
             <w:r/>
             <w:r>
               <w:rPr>
-                <w:sz w:val="17"/>
+                <w:sz w:val="19"/>
               </w:rPr>
               <w:t>Weighted symmetric ridge</w:t>
             </w:r>
@@ -1155,7 +1155,7 @@
             <w:r/>
             <w:r>
               <w:rPr>
-                <w:sz w:val="17"/>
+                <w:sz w:val="19"/>
               </w:rPr>
               <w:t>8</w:t>
             </w:r>
@@ -1172,7 +1172,7 @@
             <w:r/>
             <w:r>
               <w:rPr>
-                <w:sz w:val="17"/>
+                <w:sz w:val="19"/>
               </w:rPr>
               <w:t>1.51</w:t>
             </w:r>
@@ -1189,7 +1189,7 @@
             <w:r/>
             <w:r>
               <w:rPr>
-                <w:sz w:val="17"/>
+                <w:sz w:val="19"/>
               </w:rPr>
               <w:t>1.45</w:t>
             </w:r>
@@ -1206,7 +1206,7 @@
             <w:r/>
             <w:r>
               <w:rPr>
-                <w:sz w:val="17"/>
+                <w:sz w:val="19"/>
               </w:rPr>
               <w:t>1.52</w:t>
             </w:r>
@@ -1225,7 +1225,7 @@
             <w:r/>
             <w:r>
               <w:rPr>
-                <w:sz w:val="17"/>
+                <w:sz w:val="19"/>
               </w:rPr>
               <w:t>Final: strength + host</w:t>
             </w:r>
@@ -1242,7 +1242,7 @@
             <w:r/>
             <w:r>
               <w:rPr>
-                <w:sz w:val="17"/>
+                <w:sz w:val="19"/>
               </w:rPr>
               <w:t>2</w:t>
             </w:r>
@@ -1259,7 +1259,7 @@
             <w:r/>
             <w:r>
               <w:rPr>
-                <w:sz w:val="17"/>
+                <w:sz w:val="19"/>
               </w:rPr>
               <w:t>1.49</w:t>
             </w:r>
@@ -1276,7 +1276,7 @@
             <w:r/>
             <w:r>
               <w:rPr>
-                <w:sz w:val="17"/>
+                <w:sz w:val="19"/>
               </w:rPr>
               <w:t>1.43</w:t>
             </w:r>
@@ -1293,7 +1293,7 @@
             <w:r/>
             <w:r>
               <w:rPr>
-                <w:sz w:val="17"/>
+                <w:sz w:val="19"/>
               </w:rPr>
               <w:t>1.52</w:t>
             </w:r>
@@ -1308,7 +1308,7 @@
       <w:r>
         <w:rPr>
           <w:i/>
-          <w:sz w:val="16"/>
+          <w:sz w:val="18"/>
         </w:rPr>
         <w:t>Table 2. Out-of-sample error for model 2.1, in goals. Hold-out = last 16 matches, fitted on the first 88.</w:t>
       </w:r>
@@ -1321,7 +1321,7 @@
       <w:r>
         <w:drawing>
           <wp:inline xmlns:a="http://schemas.openxmlformats.org/drawingml/2006/main" xmlns:pic="http://schemas.openxmlformats.org/drawingml/2006/picture">
-            <wp:extent cx="6263999" cy="2117142"/>
+            <wp:extent cx="6120000" cy="2070000"/>
             <wp:docPr id="1" name="Picture 1"/>
             <wp:cNvGraphicFramePr>
               <a:graphicFrameLocks noChangeAspect="1"/>
@@ -1342,7 +1342,7 @@
                   <pic:spPr>
                     <a:xfrm>
                       <a:off x="0" y="0"/>
-                      <a:ext cx="6263999" cy="2117142"/>
+                      <a:ext cx="6120000" cy="2070000"/>
                     </a:xfrm>
                     <a:prstGeom prst="rect"/>
                   </pic:spPr>
@@ -1361,7 +1361,7 @@
       <w:r>
         <w:rPr>
           <w:i/>
-          <w:sz w:val="16"/>
+          <w:sz w:val="18"/>
         </w:rPr>
         <w:t>Figure 1. Model 2.1. (a) Fitted model with 95% confidence and prediction bands. (b) Share of 2,000 random relabellings in which each term of the full model is significant. (c) Out-of-sample RMSE of the competing models.</w:t>
       </w:r>
@@ -1453,7 +1453,7 @@
             <w:r>
               <w:rPr>
                 <w:b/>
-                <w:sz w:val="17"/>
+                <w:sz w:val="19"/>
               </w:rPr>
               <w:t>Model</w:t>
             </w:r>
@@ -1471,7 +1471,7 @@
             <w:r>
               <w:rPr>
                 <w:b/>
-                <w:sz w:val="17"/>
+                <w:sz w:val="19"/>
               </w:rPr>
               <w:t>MAE</w:t>
             </w:r>
@@ -1489,7 +1489,7 @@
             <w:r>
               <w:rPr>
                 <w:b/>
-                <w:sz w:val="17"/>
+                <w:sz w:val="19"/>
               </w:rPr>
               <w:t>RMSE</w:t>
             </w:r>
@@ -1507,7 +1507,7 @@
             <w:r>
               <w:rPr>
                 <w:b/>
-                <w:sz w:val="17"/>
+                <w:sz w:val="19"/>
               </w:rPr>
               <w:t>Normalised RMSE</w:t>
             </w:r>
@@ -1525,7 +1525,7 @@
             <w:r>
               <w:rPr>
                 <w:b/>
-                <w:sz w:val="17"/>
+                <w:sz w:val="19"/>
               </w:rPr>
               <w:t>R2</w:t>
             </w:r>
@@ -1544,7 +1544,7 @@
             <w:r/>
             <w:r>
               <w:rPr>
-                <w:sz w:val="17"/>
+                <w:sz w:val="19"/>
               </w:rPr>
               <w:t>Training-set mean (naive baseline)</w:t>
             </w:r>
@@ -1561,7 +1561,7 @@
             <w:r/>
             <w:r>
               <w:rPr>
-                <w:sz w:val="17"/>
+                <w:sz w:val="19"/>
               </w:rPr>
               <w:t>1.070</w:t>
             </w:r>
@@ -1578,7 +1578,7 @@
             <w:r/>
             <w:r>
               <w:rPr>
-                <w:sz w:val="17"/>
+                <w:sz w:val="19"/>
               </w:rPr>
               <w:t>1.418</w:t>
             </w:r>
@@ -1595,7 +1595,7 @@
             <w:r/>
             <w:r>
               <w:rPr>
-                <w:sz w:val="17"/>
+                <w:sz w:val="19"/>
               </w:rPr>
               <w:t>0.203</w:t>
             </w:r>
@@ -1612,7 +1612,7 @@
             <w:r/>
             <w:r>
               <w:rPr>
-                <w:sz w:val="17"/>
+                <w:sz w:val="19"/>
               </w:rPr>
               <w:t>-0.002</w:t>
             </w:r>
@@ -1631,7 +1631,7 @@
             <w:r/>
             <w:r>
               <w:rPr>
-                <w:sz w:val="17"/>
+                <w:sz w:val="19"/>
               </w:rPr>
               <w:t>Linear regression</w:t>
             </w:r>
@@ -1648,7 +1648,7 @@
             <w:r/>
             <w:r>
               <w:rPr>
-                <w:sz w:val="17"/>
+                <w:sz w:val="19"/>
               </w:rPr>
               <w:t>0.923</w:t>
             </w:r>
@@ -1665,7 +1665,7 @@
             <w:r/>
             <w:r>
               <w:rPr>
-                <w:sz w:val="17"/>
+                <w:sz w:val="19"/>
               </w:rPr>
               <w:t>1.287</w:t>
             </w:r>
@@ -1682,7 +1682,7 @@
             <w:r/>
             <w:r>
               <w:rPr>
-                <w:sz w:val="17"/>
+                <w:sz w:val="19"/>
               </w:rPr>
               <w:t>0.184</w:t>
             </w:r>
@@ -1699,7 +1699,7 @@
             <w:r/>
             <w:r>
               <w:rPr>
-                <w:sz w:val="17"/>
+                <w:sz w:val="19"/>
               </w:rPr>
               <w:t>0.175</w:t>
             </w:r>
@@ -1718,7 +1718,7 @@
             <w:r/>
             <w:r>
               <w:rPr>
-                <w:sz w:val="17"/>
+                <w:sz w:val="19"/>
               </w:rPr>
               <w:t>Elastic net</w:t>
             </w:r>
@@ -1735,7 +1735,7 @@
             <w:r/>
             <w:r>
               <w:rPr>
-                <w:sz w:val="17"/>
+                <w:sz w:val="19"/>
               </w:rPr>
               <w:t>0.914</w:t>
             </w:r>
@@ -1752,7 +1752,7 @@
             <w:r/>
             <w:r>
               <w:rPr>
-                <w:sz w:val="17"/>
+                <w:sz w:val="19"/>
               </w:rPr>
               <w:t>1.270</w:t>
             </w:r>
@@ -1769,7 +1769,7 @@
             <w:r/>
             <w:r>
               <w:rPr>
-                <w:sz w:val="17"/>
+                <w:sz w:val="19"/>
               </w:rPr>
               <w:t>0.181</w:t>
             </w:r>
@@ -1786,7 +1786,7 @@
             <w:r/>
             <w:r>
               <w:rPr>
-                <w:sz w:val="17"/>
+                <w:sz w:val="19"/>
               </w:rPr>
               <w:t>0.196</w:t>
             </w:r>
@@ -1805,7 +1805,7 @@
             <w:r/>
             <w:r>
               <w:rPr>
-                <w:sz w:val="17"/>
+                <w:sz w:val="19"/>
               </w:rPr>
               <w:t>Polynomial (degree 2)</w:t>
             </w:r>
@@ -1822,7 +1822,7 @@
             <w:r/>
             <w:r>
               <w:rPr>
-                <w:sz w:val="17"/>
+                <w:sz w:val="19"/>
               </w:rPr>
               <w:t>1.008</w:t>
             </w:r>
@@ -1839,7 +1839,7 @@
             <w:r/>
             <w:r>
               <w:rPr>
-                <w:sz w:val="17"/>
+                <w:sz w:val="19"/>
               </w:rPr>
               <w:t>1.352</w:t>
             </w:r>
@@ -1856,7 +1856,7 @@
             <w:r/>
             <w:r>
               <w:rPr>
-                <w:sz w:val="17"/>
+                <w:sz w:val="19"/>
               </w:rPr>
               <w:t>0.193</w:t>
             </w:r>
@@ -1873,7 +1873,7 @@
             <w:r/>
             <w:r>
               <w:rPr>
-                <w:sz w:val="17"/>
+                <w:sz w:val="19"/>
               </w:rPr>
               <w:t>0.089</w:t>
             </w:r>
@@ -1892,7 +1892,7 @@
             <w:r/>
             <w:r>
               <w:rPr>
-                <w:sz w:val="17"/>
+                <w:sz w:val="19"/>
               </w:rPr>
               <w:t>Random forest</w:t>
             </w:r>
@@ -1909,7 +1909,7 @@
             <w:r/>
             <w:r>
               <w:rPr>
-                <w:sz w:val="17"/>
+                <w:sz w:val="19"/>
               </w:rPr>
               <w:t>1.002</w:t>
             </w:r>
@@ -1926,7 +1926,7 @@
             <w:r/>
             <w:r>
               <w:rPr>
-                <w:sz w:val="17"/>
+                <w:sz w:val="19"/>
               </w:rPr>
               <w:t>1.361</w:t>
             </w:r>
@@ -1943,7 +1943,7 @@
             <w:r/>
             <w:r>
               <w:rPr>
-                <w:sz w:val="17"/>
+                <w:sz w:val="19"/>
               </w:rPr>
               <w:t>0.194</w:t>
             </w:r>
@@ -1960,7 +1960,7 @@
             <w:r/>
             <w:r>
               <w:rPr>
-                <w:sz w:val="17"/>
+                <w:sz w:val="19"/>
               </w:rPr>
               <w:t>0.077</w:t>
             </w:r>
@@ -1979,7 +1979,7 @@
             <w:r/>
             <w:r>
               <w:rPr>
-                <w:sz w:val="17"/>
+                <w:sz w:val="19"/>
               </w:rPr>
               <w:t>Gradient boosting</w:t>
             </w:r>
@@ -1996,7 +1996,7 @@
             <w:r/>
             <w:r>
               <w:rPr>
-                <w:sz w:val="17"/>
+                <w:sz w:val="19"/>
               </w:rPr>
               <w:t>1.055</w:t>
             </w:r>
@@ -2013,7 +2013,7 @@
             <w:r/>
             <w:r>
               <w:rPr>
-                <w:sz w:val="17"/>
+                <w:sz w:val="19"/>
               </w:rPr>
               <w:t>1.498</w:t>
             </w:r>
@@ -2030,7 +2030,7 @@
             <w:r/>
             <w:r>
               <w:rPr>
-                <w:sz w:val="17"/>
+                <w:sz w:val="19"/>
               </w:rPr>
               <w:t>0.214</w:t>
             </w:r>
@@ -2047,7 +2047,7 @@
             <w:r/>
             <w:r>
               <w:rPr>
-                <w:sz w:val="17"/>
+                <w:sz w:val="19"/>
               </w:rPr>
               <w:t>-0.118</w:t>
             </w:r>
@@ -2062,7 +2062,7 @@
       <w:r>
         <w:rPr>
           <w:i/>
-          <w:sz w:val="16"/>
+          <w:sz w:val="18"/>
         </w:rPr>
         <w:t>Table 3. Model 2.2 against competing regression algorithms on the same 80/20 hold-out (random_state = 42). Ridge and lasso, omitted for space, fall between linear regression and elastic net.</w:t>
       </w:r>
@@ -2075,7 +2075,7 @@
       <w:r>
         <w:drawing>
           <wp:inline xmlns:a="http://schemas.openxmlformats.org/drawingml/2006/main" xmlns:pic="http://schemas.openxmlformats.org/drawingml/2006/picture">
-            <wp:extent cx="6263999" cy="1879200"/>
+            <wp:extent cx="6120000" cy="1835999"/>
             <wp:docPr id="2" name="Picture 2"/>
             <wp:cNvGraphicFramePr>
               <a:graphicFrameLocks noChangeAspect="1"/>
@@ -2096,7 +2096,7 @@
                   <pic:spPr>
                     <a:xfrm>
                       <a:off x="0" y="0"/>
-                      <a:ext cx="6263999" cy="1879200"/>
+                      <a:ext cx="6120000" cy="1835999"/>
                     </a:xfrm>
                     <a:prstGeom prst="rect"/>
                   </pic:spPr>
@@ -2115,7 +2115,7 @@
       <w:r>
         <w:rPr>
           <w:i/>
-          <w:sz w:val="16"/>
+          <w:sz w:val="18"/>
         </w:rPr>
         <w:t>Figure 2. Model 2.2 diagnostics. (a) Predicted against actual goals. (b) Residuals against fitted values. (c) Normal Q-Q plot, showing the departure from normality caused by the 26.4% of team-matches with no goals.</w:t>
       </w:r>
@@ -2170,7 +2170,7 @@
     </w:p>
     <w:sectPr>
       <w:pgSz w:w="11906" w:h="16838"/>
-      <w:pgMar w:top="907" w:right="907" w:bottom="907" w:left="907" w:header="720" w:footer="720" w:gutter="0"/>
+      <w:pgMar w:top="1134" w:right="1134" w:bottom="1134" w:left="1134" w:header="720" w:footer="720" w:gutter="0"/>
       <w:cols w:space="720"/>
       <w:docGrid w:linePitch="360"/>
     </w:sectPr>
@@ -2542,7 +2542,7 @@
     <w:qFormat/>
     <w:rsid w:val="00FC693F"/>
     <w:pPr>
-      <w:spacing w:line="240" w:lineRule="auto" w:before="0" w:after="80"/>
+      <w:spacing w:line="240" w:lineRule="auto" w:before="0" w:after="120"/>
     </w:pPr>
     <w:rPr>
       <w:rFonts w:ascii="Calibri" w:hAnsi="Calibri" w:eastAsia="Calibri"/>

</xml_diff>

<commit_message>
feat(report): two purpose-built figures replacing a table and a diagnostics plot
The rubric's high-distinction band asks for creative, original visualisations that support effective data storytelling. Figure 2 now plots the competing-algorithm comparison that was previously a seven-row table: gradient boosting visibly crosses the naive-baseline line, which the table did not convey. Figure 3 is new and carries the central finding of the report across both models - that pre-tournament strength dominates and in-tournament form is largely a restatement of it, shown as a ranked correlation chart for model 2.2 beside the collapse from raw to partial correlation for model 2.1. The standard diagnostics triptych was dropped from the report; its numbers remain in the text and the plots remain in the repository. src/make_report_figures.py regenerates both.
</commit_message>
<xml_diff>
--- a/report/HIT140_A3_Group26_report.docx
+++ b/report/HIT140_A3_Group26_report.docx
@@ -1423,648 +1423,7 @@
           <w:i w:val="0"/>
           <w:sz w:val="20"/>
         </w:rPr>
-        <w:t>Competing algorithms. Six alternatives were fitted on the same 80/20 split (Table 3). Every non-linear and ensemble method performed worse than ordinary linear regression, and gradient boosting was worse than predicting the training mean. Only the regularised linear models improved on OLS, and only marginally (R2 0.175 to 0.196). With 208 rows and eight variables, flexible models overfit; we therefore recommend retaining linear regression, which is both the more interpretable and, in practice, the more accurate choice, with elastic net as a defensible alternative.</w:t>
-      </w:r>
-    </w:p>
-    <w:tbl>
-      <w:tblPr>
-        <w:tblStyle w:val="TableGrid"/>
-        <w:tblW w:type="auto" w:w="0"/>
-        <w:jc w:val="center"/>
-        <w:tblLook w:firstColumn="1" w:firstRow="1" w:lastColumn="0" w:lastRow="0" w:noHBand="0" w:noVBand="1" w:val="04A0"/>
-      </w:tblPr>
-      <w:tblGrid>
-        <w:gridCol w:w="2018"/>
-        <w:gridCol w:w="2018"/>
-        <w:gridCol w:w="2018"/>
-        <w:gridCol w:w="2018"/>
-        <w:gridCol w:w="2018"/>
-      </w:tblGrid>
-      <w:tr>
-        <w:tc>
-          <w:tcPr>
-            <w:tcW w:type="dxa" w:w="3628"/>
-          </w:tcPr>
-          <w:p>
-            <w:pPr>
-              <w:spacing w:before="10" w:after="10"/>
-            </w:pPr>
-            <w:r/>
-            <w:r>
-              <w:rPr>
-                <w:b/>
-                <w:sz w:val="19"/>
-              </w:rPr>
-              <w:t>Model</w:t>
-            </w:r>
-          </w:p>
-        </w:tc>
-        <w:tc>
-          <w:tcPr>
-            <w:tcW w:type="dxa" w:w="1361"/>
-          </w:tcPr>
-          <w:p>
-            <w:pPr>
-              <w:spacing w:before="10" w:after="10"/>
-            </w:pPr>
-            <w:r/>
-            <w:r>
-              <w:rPr>
-                <w:b/>
-                <w:sz w:val="19"/>
-              </w:rPr>
-              <w:t>MAE</w:t>
-            </w:r>
-          </w:p>
-        </w:tc>
-        <w:tc>
-          <w:tcPr>
-            <w:tcW w:type="dxa" w:w="1361"/>
-          </w:tcPr>
-          <w:p>
-            <w:pPr>
-              <w:spacing w:before="10" w:after="10"/>
-            </w:pPr>
-            <w:r/>
-            <w:r>
-              <w:rPr>
-                <w:b/>
-                <w:sz w:val="19"/>
-              </w:rPr>
-              <w:t>RMSE</w:t>
-            </w:r>
-          </w:p>
-        </w:tc>
-        <w:tc>
-          <w:tcPr>
-            <w:tcW w:type="dxa" w:w="1928"/>
-          </w:tcPr>
-          <w:p>
-            <w:pPr>
-              <w:spacing w:before="10" w:after="10"/>
-            </w:pPr>
-            <w:r/>
-            <w:r>
-              <w:rPr>
-                <w:b/>
-                <w:sz w:val="19"/>
-              </w:rPr>
-              <w:t>Normalised RMSE</w:t>
-            </w:r>
-          </w:p>
-        </w:tc>
-        <w:tc>
-          <w:tcPr>
-            <w:tcW w:type="dxa" w:w="1134"/>
-          </w:tcPr>
-          <w:p>
-            <w:pPr>
-              <w:spacing w:before="10" w:after="10"/>
-            </w:pPr>
-            <w:r/>
-            <w:r>
-              <w:rPr>
-                <w:b/>
-                <w:sz w:val="19"/>
-              </w:rPr>
-              <w:t>R2</w:t>
-            </w:r>
-          </w:p>
-        </w:tc>
-      </w:tr>
-      <w:tr>
-        <w:tc>
-          <w:tcPr>
-            <w:tcW w:type="dxa" w:w="3628"/>
-          </w:tcPr>
-          <w:p>
-            <w:pPr>
-              <w:spacing w:before="10" w:after="10"/>
-            </w:pPr>
-            <w:r/>
-            <w:r>
-              <w:rPr>
-                <w:sz w:val="19"/>
-              </w:rPr>
-              <w:t>Training-set mean (naive baseline)</w:t>
-            </w:r>
-          </w:p>
-        </w:tc>
-        <w:tc>
-          <w:tcPr>
-            <w:tcW w:type="dxa" w:w="1361"/>
-          </w:tcPr>
-          <w:p>
-            <w:pPr>
-              <w:spacing w:before="10" w:after="10"/>
-            </w:pPr>
-            <w:r/>
-            <w:r>
-              <w:rPr>
-                <w:sz w:val="19"/>
-              </w:rPr>
-              <w:t>1.070</w:t>
-            </w:r>
-          </w:p>
-        </w:tc>
-        <w:tc>
-          <w:tcPr>
-            <w:tcW w:type="dxa" w:w="1361"/>
-          </w:tcPr>
-          <w:p>
-            <w:pPr>
-              <w:spacing w:before="10" w:after="10"/>
-            </w:pPr>
-            <w:r/>
-            <w:r>
-              <w:rPr>
-                <w:sz w:val="19"/>
-              </w:rPr>
-              <w:t>1.418</w:t>
-            </w:r>
-          </w:p>
-        </w:tc>
-        <w:tc>
-          <w:tcPr>
-            <w:tcW w:type="dxa" w:w="1928"/>
-          </w:tcPr>
-          <w:p>
-            <w:pPr>
-              <w:spacing w:before="10" w:after="10"/>
-            </w:pPr>
-            <w:r/>
-            <w:r>
-              <w:rPr>
-                <w:sz w:val="19"/>
-              </w:rPr>
-              <w:t>0.203</w:t>
-            </w:r>
-          </w:p>
-        </w:tc>
-        <w:tc>
-          <w:tcPr>
-            <w:tcW w:type="dxa" w:w="1134"/>
-          </w:tcPr>
-          <w:p>
-            <w:pPr>
-              <w:spacing w:before="10" w:after="10"/>
-            </w:pPr>
-            <w:r/>
-            <w:r>
-              <w:rPr>
-                <w:sz w:val="19"/>
-              </w:rPr>
-              <w:t>-0.002</w:t>
-            </w:r>
-          </w:p>
-        </w:tc>
-      </w:tr>
-      <w:tr>
-        <w:tc>
-          <w:tcPr>
-            <w:tcW w:type="dxa" w:w="3628"/>
-          </w:tcPr>
-          <w:p>
-            <w:pPr>
-              <w:spacing w:before="10" w:after="10"/>
-            </w:pPr>
-            <w:r/>
-            <w:r>
-              <w:rPr>
-                <w:sz w:val="19"/>
-              </w:rPr>
-              <w:t>Linear regression</w:t>
-            </w:r>
-          </w:p>
-        </w:tc>
-        <w:tc>
-          <w:tcPr>
-            <w:tcW w:type="dxa" w:w="1361"/>
-          </w:tcPr>
-          <w:p>
-            <w:pPr>
-              <w:spacing w:before="10" w:after="10"/>
-            </w:pPr>
-            <w:r/>
-            <w:r>
-              <w:rPr>
-                <w:sz w:val="19"/>
-              </w:rPr>
-              <w:t>0.923</w:t>
-            </w:r>
-          </w:p>
-        </w:tc>
-        <w:tc>
-          <w:tcPr>
-            <w:tcW w:type="dxa" w:w="1361"/>
-          </w:tcPr>
-          <w:p>
-            <w:pPr>
-              <w:spacing w:before="10" w:after="10"/>
-            </w:pPr>
-            <w:r/>
-            <w:r>
-              <w:rPr>
-                <w:sz w:val="19"/>
-              </w:rPr>
-              <w:t>1.287</w:t>
-            </w:r>
-          </w:p>
-        </w:tc>
-        <w:tc>
-          <w:tcPr>
-            <w:tcW w:type="dxa" w:w="1928"/>
-          </w:tcPr>
-          <w:p>
-            <w:pPr>
-              <w:spacing w:before="10" w:after="10"/>
-            </w:pPr>
-            <w:r/>
-            <w:r>
-              <w:rPr>
-                <w:sz w:val="19"/>
-              </w:rPr>
-              <w:t>0.184</w:t>
-            </w:r>
-          </w:p>
-        </w:tc>
-        <w:tc>
-          <w:tcPr>
-            <w:tcW w:type="dxa" w:w="1134"/>
-          </w:tcPr>
-          <w:p>
-            <w:pPr>
-              <w:spacing w:before="10" w:after="10"/>
-            </w:pPr>
-            <w:r/>
-            <w:r>
-              <w:rPr>
-                <w:sz w:val="19"/>
-              </w:rPr>
-              <w:t>0.175</w:t>
-            </w:r>
-          </w:p>
-        </w:tc>
-      </w:tr>
-      <w:tr>
-        <w:tc>
-          <w:tcPr>
-            <w:tcW w:type="dxa" w:w="3628"/>
-          </w:tcPr>
-          <w:p>
-            <w:pPr>
-              <w:spacing w:before="10" w:after="10"/>
-            </w:pPr>
-            <w:r/>
-            <w:r>
-              <w:rPr>
-                <w:sz w:val="19"/>
-              </w:rPr>
-              <w:t>Elastic net</w:t>
-            </w:r>
-          </w:p>
-        </w:tc>
-        <w:tc>
-          <w:tcPr>
-            <w:tcW w:type="dxa" w:w="1361"/>
-          </w:tcPr>
-          <w:p>
-            <w:pPr>
-              <w:spacing w:before="10" w:after="10"/>
-            </w:pPr>
-            <w:r/>
-            <w:r>
-              <w:rPr>
-                <w:sz w:val="19"/>
-              </w:rPr>
-              <w:t>0.914</w:t>
-            </w:r>
-          </w:p>
-        </w:tc>
-        <w:tc>
-          <w:tcPr>
-            <w:tcW w:type="dxa" w:w="1361"/>
-          </w:tcPr>
-          <w:p>
-            <w:pPr>
-              <w:spacing w:before="10" w:after="10"/>
-            </w:pPr>
-            <w:r/>
-            <w:r>
-              <w:rPr>
-                <w:sz w:val="19"/>
-              </w:rPr>
-              <w:t>1.270</w:t>
-            </w:r>
-          </w:p>
-        </w:tc>
-        <w:tc>
-          <w:tcPr>
-            <w:tcW w:type="dxa" w:w="1928"/>
-          </w:tcPr>
-          <w:p>
-            <w:pPr>
-              <w:spacing w:before="10" w:after="10"/>
-            </w:pPr>
-            <w:r/>
-            <w:r>
-              <w:rPr>
-                <w:sz w:val="19"/>
-              </w:rPr>
-              <w:t>0.181</w:t>
-            </w:r>
-          </w:p>
-        </w:tc>
-        <w:tc>
-          <w:tcPr>
-            <w:tcW w:type="dxa" w:w="1134"/>
-          </w:tcPr>
-          <w:p>
-            <w:pPr>
-              <w:spacing w:before="10" w:after="10"/>
-            </w:pPr>
-            <w:r/>
-            <w:r>
-              <w:rPr>
-                <w:sz w:val="19"/>
-              </w:rPr>
-              <w:t>0.196</w:t>
-            </w:r>
-          </w:p>
-        </w:tc>
-      </w:tr>
-      <w:tr>
-        <w:tc>
-          <w:tcPr>
-            <w:tcW w:type="dxa" w:w="3628"/>
-          </w:tcPr>
-          <w:p>
-            <w:pPr>
-              <w:spacing w:before="10" w:after="10"/>
-            </w:pPr>
-            <w:r/>
-            <w:r>
-              <w:rPr>
-                <w:sz w:val="19"/>
-              </w:rPr>
-              <w:t>Polynomial (degree 2)</w:t>
-            </w:r>
-          </w:p>
-        </w:tc>
-        <w:tc>
-          <w:tcPr>
-            <w:tcW w:type="dxa" w:w="1361"/>
-          </w:tcPr>
-          <w:p>
-            <w:pPr>
-              <w:spacing w:before="10" w:after="10"/>
-            </w:pPr>
-            <w:r/>
-            <w:r>
-              <w:rPr>
-                <w:sz w:val="19"/>
-              </w:rPr>
-              <w:t>1.008</w:t>
-            </w:r>
-          </w:p>
-        </w:tc>
-        <w:tc>
-          <w:tcPr>
-            <w:tcW w:type="dxa" w:w="1361"/>
-          </w:tcPr>
-          <w:p>
-            <w:pPr>
-              <w:spacing w:before="10" w:after="10"/>
-            </w:pPr>
-            <w:r/>
-            <w:r>
-              <w:rPr>
-                <w:sz w:val="19"/>
-              </w:rPr>
-              <w:t>1.352</w:t>
-            </w:r>
-          </w:p>
-        </w:tc>
-        <w:tc>
-          <w:tcPr>
-            <w:tcW w:type="dxa" w:w="1928"/>
-          </w:tcPr>
-          <w:p>
-            <w:pPr>
-              <w:spacing w:before="10" w:after="10"/>
-            </w:pPr>
-            <w:r/>
-            <w:r>
-              <w:rPr>
-                <w:sz w:val="19"/>
-              </w:rPr>
-              <w:t>0.193</w:t>
-            </w:r>
-          </w:p>
-        </w:tc>
-        <w:tc>
-          <w:tcPr>
-            <w:tcW w:type="dxa" w:w="1134"/>
-          </w:tcPr>
-          <w:p>
-            <w:pPr>
-              <w:spacing w:before="10" w:after="10"/>
-            </w:pPr>
-            <w:r/>
-            <w:r>
-              <w:rPr>
-                <w:sz w:val="19"/>
-              </w:rPr>
-              <w:t>0.089</w:t>
-            </w:r>
-          </w:p>
-        </w:tc>
-      </w:tr>
-      <w:tr>
-        <w:tc>
-          <w:tcPr>
-            <w:tcW w:type="dxa" w:w="3628"/>
-          </w:tcPr>
-          <w:p>
-            <w:pPr>
-              <w:spacing w:before="10" w:after="10"/>
-            </w:pPr>
-            <w:r/>
-            <w:r>
-              <w:rPr>
-                <w:sz w:val="19"/>
-              </w:rPr>
-              <w:t>Random forest</w:t>
-            </w:r>
-          </w:p>
-        </w:tc>
-        <w:tc>
-          <w:tcPr>
-            <w:tcW w:type="dxa" w:w="1361"/>
-          </w:tcPr>
-          <w:p>
-            <w:pPr>
-              <w:spacing w:before="10" w:after="10"/>
-            </w:pPr>
-            <w:r/>
-            <w:r>
-              <w:rPr>
-                <w:sz w:val="19"/>
-              </w:rPr>
-              <w:t>1.002</w:t>
-            </w:r>
-          </w:p>
-        </w:tc>
-        <w:tc>
-          <w:tcPr>
-            <w:tcW w:type="dxa" w:w="1361"/>
-          </w:tcPr>
-          <w:p>
-            <w:pPr>
-              <w:spacing w:before="10" w:after="10"/>
-            </w:pPr>
-            <w:r/>
-            <w:r>
-              <w:rPr>
-                <w:sz w:val="19"/>
-              </w:rPr>
-              <w:t>1.361</w:t>
-            </w:r>
-          </w:p>
-        </w:tc>
-        <w:tc>
-          <w:tcPr>
-            <w:tcW w:type="dxa" w:w="1928"/>
-          </w:tcPr>
-          <w:p>
-            <w:pPr>
-              <w:spacing w:before="10" w:after="10"/>
-            </w:pPr>
-            <w:r/>
-            <w:r>
-              <w:rPr>
-                <w:sz w:val="19"/>
-              </w:rPr>
-              <w:t>0.194</w:t>
-            </w:r>
-          </w:p>
-        </w:tc>
-        <w:tc>
-          <w:tcPr>
-            <w:tcW w:type="dxa" w:w="1134"/>
-          </w:tcPr>
-          <w:p>
-            <w:pPr>
-              <w:spacing w:before="10" w:after="10"/>
-            </w:pPr>
-            <w:r/>
-            <w:r>
-              <w:rPr>
-                <w:sz w:val="19"/>
-              </w:rPr>
-              <w:t>0.077</w:t>
-            </w:r>
-          </w:p>
-        </w:tc>
-      </w:tr>
-      <w:tr>
-        <w:tc>
-          <w:tcPr>
-            <w:tcW w:type="dxa" w:w="3628"/>
-          </w:tcPr>
-          <w:p>
-            <w:pPr>
-              <w:spacing w:before="10" w:after="10"/>
-            </w:pPr>
-            <w:r/>
-            <w:r>
-              <w:rPr>
-                <w:sz w:val="19"/>
-              </w:rPr>
-              <w:t>Gradient boosting</w:t>
-            </w:r>
-          </w:p>
-        </w:tc>
-        <w:tc>
-          <w:tcPr>
-            <w:tcW w:type="dxa" w:w="1361"/>
-          </w:tcPr>
-          <w:p>
-            <w:pPr>
-              <w:spacing w:before="10" w:after="10"/>
-            </w:pPr>
-            <w:r/>
-            <w:r>
-              <w:rPr>
-                <w:sz w:val="19"/>
-              </w:rPr>
-              <w:t>1.055</w:t>
-            </w:r>
-          </w:p>
-        </w:tc>
-        <w:tc>
-          <w:tcPr>
-            <w:tcW w:type="dxa" w:w="1361"/>
-          </w:tcPr>
-          <w:p>
-            <w:pPr>
-              <w:spacing w:before="10" w:after="10"/>
-            </w:pPr>
-            <w:r/>
-            <w:r>
-              <w:rPr>
-                <w:sz w:val="19"/>
-              </w:rPr>
-              <w:t>1.498</w:t>
-            </w:r>
-          </w:p>
-        </w:tc>
-        <w:tc>
-          <w:tcPr>
-            <w:tcW w:type="dxa" w:w="1928"/>
-          </w:tcPr>
-          <w:p>
-            <w:pPr>
-              <w:spacing w:before="10" w:after="10"/>
-            </w:pPr>
-            <w:r/>
-            <w:r>
-              <w:rPr>
-                <w:sz w:val="19"/>
-              </w:rPr>
-              <w:t>0.214</w:t>
-            </w:r>
-          </w:p>
-        </w:tc>
-        <w:tc>
-          <w:tcPr>
-            <w:tcW w:type="dxa" w:w="1134"/>
-          </w:tcPr>
-          <w:p>
-            <w:pPr>
-              <w:spacing w:before="10" w:after="10"/>
-            </w:pPr>
-            <w:r/>
-            <w:r>
-              <w:rPr>
-                <w:sz w:val="19"/>
-              </w:rPr>
-              <w:t>-0.118</w:t>
-            </w:r>
-          </w:p>
-        </w:tc>
-      </w:tr>
-    </w:tbl>
-    <w:p>
-      <w:pPr>
-        <w:spacing w:after="80"/>
-      </w:pPr>
-      <w:r>
-        <w:rPr>
-          <w:i/>
-          <w:sz w:val="18"/>
-        </w:rPr>
-        <w:t>Table 3. Model 2.2 against competing regression algorithms on the same 80/20 hold-out (random_state = 42). Ridge and lasso, omitted for space, fall between linear regression and elastic net.</w:t>
+        <w:t>Competing algorithms. Six alternatives were fitted on the same 80/20 split (Figure 2). Every non-linear and ensemble method performed worse than ordinary linear regression, and gradient boosting was worse than predicting the training mean. Only the regularised linear models improved on OLS, and only marginally (R2 0.175 to 0.196). With 208 rows and eight variables, flexible models overfit; we therefore recommend retaining linear regression, which is both the more interpretable and, in practice, the more accurate choice, with elastic net as a defensible alternative.</w:t>
       </w:r>
     </w:p>
     <w:p>
@@ -2075,7 +1434,7 @@
       <w:r>
         <w:drawing>
           <wp:inline xmlns:a="http://schemas.openxmlformats.org/drawingml/2006/main" xmlns:pic="http://schemas.openxmlformats.org/drawingml/2006/picture">
-            <wp:extent cx="6120000" cy="1835999"/>
+            <wp:extent cx="6120000" cy="1698373"/>
             <wp:docPr id="2" name="Picture 2"/>
             <wp:cNvGraphicFramePr>
               <a:graphicFrameLocks noChangeAspect="1"/>
@@ -2084,11 +1443,11 @@
               <a:graphicData uri="http://schemas.openxmlformats.org/drawingml/2006/picture">
                 <pic:pic>
                   <pic:nvPicPr>
-                    <pic:cNvPr id="0" name="report_figure_LR22.png"/>
+                    <pic:cNvPr id="0" name="report_figure_models.png"/>
                     <pic:cNvPicPr/>
                   </pic:nvPicPr>
                   <pic:blipFill>
-                    <a:blip r:embed="rId10"/>
+                    <a:blip r:embed="rId11"/>
                     <a:stretch>
                       <a:fillRect/>
                     </a:stretch>
@@ -2096,7 +1455,7 @@
                   <pic:spPr>
                     <a:xfrm>
                       <a:off x="0" y="0"/>
-                      <a:ext cx="6120000" cy="1835999"/>
+                      <a:ext cx="6120000" cy="1698373"/>
                     </a:xfrm>
                     <a:prstGeom prst="rect"/>
                   </pic:spPr>
@@ -2117,7 +1476,7 @@
           <w:i/>
           <w:sz w:val="18"/>
         </w:rPr>
-        <w:t>Figure 2. Model 2.2 diagnostics. (a) Predicted against actual goals. (b) Residuals against fitted values. (c) Normal Q-Q plot, showing the departure from normality caused by the 26.4% of team-matches with no goals.</w:t>
+        <w:t>Figure 2. Model 2.2 against six competing regression algorithms on the same 80/20 hold-out. Only the regularised linear models improve on ordinary least squares, and marginally; gradient boosting is worse than predicting the training mean. Residual diagnostic plots are in the repository.</w:t>
       </w:r>
     </w:p>
     <w:p>
@@ -2166,6 +1525,59 @@
           <w:sz w:val="20"/>
         </w:rPr>
         <w:t>For prediction we recommend the symmetric two-term model for goal difference and the six-variable linear regression for goals scored. For interpretation the lesson is blunter: most of what decides a World Cup match is settled before the tournament starts, and the rest is largely not forecastable from data available beforehand.</w:t>
+      </w:r>
+    </w:p>
+    <w:p>
+      <w:pPr>
+        <w:spacing w:after="20" w:before="80"/>
+        <w:jc w:val="center"/>
+      </w:pPr>
+      <w:r>
+        <w:drawing>
+          <wp:inline xmlns:a="http://schemas.openxmlformats.org/drawingml/2006/main" xmlns:pic="http://schemas.openxmlformats.org/drawingml/2006/picture">
+            <wp:extent cx="6120000" cy="1761186"/>
+            <wp:docPr id="3" name="Picture 3"/>
+            <wp:cNvGraphicFramePr>
+              <a:graphicFrameLocks noChangeAspect="1"/>
+            </wp:cNvGraphicFramePr>
+            <a:graphic>
+              <a:graphicData uri="http://schemas.openxmlformats.org/drawingml/2006/picture">
+                <pic:pic>
+                  <pic:nvPicPr>
+                    <pic:cNvPr id="0" name="report_figure_form.png"/>
+                    <pic:cNvPicPr/>
+                  </pic:nvPicPr>
+                  <pic:blipFill>
+                    <a:blip r:embed="rId12"/>
+                    <a:stretch>
+                      <a:fillRect/>
+                    </a:stretch>
+                  </pic:blipFill>
+                  <pic:spPr>
+                    <a:xfrm>
+                      <a:off x="0" y="0"/>
+                      <a:ext cx="6120000" cy="1761186"/>
+                    </a:xfrm>
+                    <a:prstGeom prst="rect"/>
+                  </pic:spPr>
+                </pic:pic>
+              </a:graphicData>
+            </a:graphic>
+          </wp:inline>
+        </w:drawing>
+      </w:r>
+    </w:p>
+    <w:p>
+      <w:pPr>
+        <w:spacing w:after="40" w:before="80"/>
+        <w:jc w:val="center"/>
+      </w:pPr>
+      <w:r>
+        <w:rPr>
+          <w:i/>
+          <w:sz w:val="18"/>
+        </w:rPr>
+        <w:t>Figure 3. Why both models reach the same verdict on form. (a) In model 2.2 the four variables measuring pre-tournament strength and venue outrank the three form variables, two of which sit on zero. (b) In model 2.1 the raw correlation of form with goal difference (filled) collapses to the chance level once strength is controlled for (open): form is largely a restatement of strength the teams already had.</w:t>
       </w:r>
     </w:p>
     <w:sectPr>

</xml_diff>

<commit_message>
feat: cover the remaining two Week 9 optimisation techniques
The Week 9 practical sets out four optimisation techniques. Non-linear transformation and multicollinearity removal were already covered; rescaling and the Gaussian transform were not. Both are now applied to both models and reported. Z-score standardisation leaves ordinary least squares unchanged, as it must. A Yeo-Johnson transform improves hold-out RMSE from 1.287 to 1.252 in model 2.2 and from 1.500 to 1.463 in model 2.1, at the cost of interpretable coefficients; the report records this as an available refinement rather than adopting it.
</commit_message>
<xml_diff>
--- a/report/HIT140_A3_Group26_report.docx
+++ b/report/HIT140_A3_Group26_report.docx
@@ -1428,6 +1428,17 @@
     </w:p>
     <w:p>
       <w:pPr>
+        <w:spacing w:after="120"/>
+      </w:pPr>
+      <w:r>
+        <w:rPr>
+          <w:sz w:val="20"/>
+        </w:rPr>
+        <w:t>Two further optimisations from the Week 9 practical were applied to both models. Z-score standardisation left them unchanged to four decimal places (RMSE 1.287 and 1.500 before and after), which is the expected result: rescaling a predictor rescales its coefficient and nothing else in ordinary least squares. A Yeo-Johnson transform of the predictors did help, lowering hold-out RMSE from 1.287 to 1.252 and raising R2 from 0.175 to 0.219 in model 2.2, and from 1.500 to 1.463 and 0.417 to 0.445 in model 2.1. The gain is under three per cent and is bought with coefficients that no longer carry a direct football interpretation, so we report the untransformed models and record the transform as the available refinement.</w:t>
+      </w:r>
+    </w:p>
+    <w:p>
+      <w:pPr>
         <w:spacing w:before="60" w:after="20"/>
         <w:jc w:val="center"/>
       </w:pPr>

</xml_diff>

<commit_message>
style: enlarge the two purpose-built figures to use the available page
The report occupied a little over three of the four permitted pages, leaving most of the fourth empty. Figures 2 and 3 are regenerated on a taller canvas (aspect ratio 2.5 rather than 3.5), which makes the bars and labels substantially easier to read at the printed width, and paragraph spacing is slightly increased. No content was added: the brief states there is no minimum length.
</commit_message>
<xml_diff>
--- a/report/HIT140_A3_Group26_report.docx
+++ b/report/HIT140_A3_Group26_report.docx
@@ -41,7 +41,7 @@
     </w:p>
     <w:p>
       <w:pPr>
-        <w:spacing w:before="120" w:after="40"/>
+        <w:spacing w:before="200" w:after="40"/>
       </w:pPr>
       <w:r>
         <w:rPr>
@@ -77,7 +77,7 @@
     </w:p>
     <w:p>
       <w:pPr>
-        <w:spacing w:before="120" w:after="40"/>
+        <w:spacing w:before="200" w:after="40"/>
       </w:pPr>
       <w:r>
         <w:rPr>
@@ -777,7 +777,7 @@
     </w:tbl>
     <w:p>
       <w:pPr>
-        <w:spacing w:after="120"/>
+        <w:spacing w:after="180"/>
       </w:pPr>
       <w:r>
         <w:rPr>
@@ -789,7 +789,7 @@
     </w:p>
     <w:p>
       <w:pPr>
-        <w:spacing w:before="120" w:after="40"/>
+        <w:spacing w:before="200" w:after="40"/>
       </w:pPr>
       <w:r>
         <w:rPr>
@@ -1303,7 +1303,7 @@
     </w:tbl>
     <w:p>
       <w:pPr>
-        <w:spacing w:after="80"/>
+        <w:spacing w:after="180"/>
       </w:pPr>
       <w:r>
         <w:rPr>
@@ -1355,7 +1355,7 @@
     </w:p>
     <w:p>
       <w:pPr>
-        <w:spacing w:after="100"/>
+        <w:spacing w:after="180"/>
         <w:jc w:val="center"/>
       </w:pPr>
       <w:r>
@@ -1368,7 +1368,7 @@
     </w:p>
     <w:p>
       <w:pPr>
-        <w:spacing w:before="120" w:after="40"/>
+        <w:spacing w:before="200" w:after="40"/>
       </w:pPr>
       <w:r>
         <w:rPr>
@@ -1445,8 +1445,8 @@
       <w:r>
         <w:drawing>
           <wp:inline xmlns:a="http://schemas.openxmlformats.org/drawingml/2006/main" xmlns:pic="http://schemas.openxmlformats.org/drawingml/2006/picture">
-            <wp:extent cx="6120000" cy="1698373"/>
-            <wp:docPr id="2" name="Picture 2"/>
+            <wp:extent cx="6120000" cy="2443741"/>
+            <wp:docPr id="4" name="Picture 4"/>
             <wp:cNvGraphicFramePr>
               <a:graphicFrameLocks noChangeAspect="1"/>
             </wp:cNvGraphicFramePr>
@@ -1458,7 +1458,7 @@
                     <pic:cNvPicPr/>
                   </pic:nvPicPr>
                   <pic:blipFill>
-                    <a:blip r:embed="rId11"/>
+                    <a:blip r:embed="rId13"/>
                     <a:stretch>
                       <a:fillRect/>
                     </a:stretch>
@@ -1466,7 +1466,7 @@
                   <pic:spPr>
                     <a:xfrm>
                       <a:off x="0" y="0"/>
-                      <a:ext cx="6120000" cy="1698373"/>
+                      <a:ext cx="6120000" cy="2443741"/>
                     </a:xfrm>
                     <a:prstGeom prst="rect"/>
                   </pic:spPr>
@@ -1479,7 +1479,7 @@
     </w:p>
     <w:p>
       <w:pPr>
-        <w:spacing w:after="100"/>
+        <w:spacing w:after="180"/>
         <w:jc w:val="center"/>
       </w:pPr>
       <w:r>
@@ -1492,7 +1492,7 @@
     </w:p>
     <w:p>
       <w:pPr>
-        <w:spacing w:before="120" w:after="40"/>
+        <w:spacing w:before="200" w:after="40"/>
       </w:pPr>
       <w:r>
         <w:rPr>
@@ -1546,8 +1546,8 @@
       <w:r>
         <w:drawing>
           <wp:inline xmlns:a="http://schemas.openxmlformats.org/drawingml/2006/main" xmlns:pic="http://schemas.openxmlformats.org/drawingml/2006/picture">
-            <wp:extent cx="6120000" cy="1761186"/>
-            <wp:docPr id="3" name="Picture 3"/>
+            <wp:extent cx="6120000" cy="2349884"/>
+            <wp:docPr id="5" name="Picture 5"/>
             <wp:cNvGraphicFramePr>
               <a:graphicFrameLocks noChangeAspect="1"/>
             </wp:cNvGraphicFramePr>
@@ -1559,7 +1559,7 @@
                     <pic:cNvPicPr/>
                   </pic:nvPicPr>
                   <pic:blipFill>
-                    <a:blip r:embed="rId12"/>
+                    <a:blip r:embed="rId14"/>
                     <a:stretch>
                       <a:fillRect/>
                     </a:stretch>
@@ -1567,7 +1567,7 @@
                   <pic:spPr>
                     <a:xfrm>
                       <a:off x="0" y="0"/>
-                      <a:ext cx="6120000" cy="1761186"/>
+                      <a:ext cx="6120000" cy="2349884"/>
                     </a:xfrm>
                     <a:prstGeom prst="rect"/>
                   </pic:spPr>
@@ -1580,7 +1580,7 @@
     </w:p>
     <w:p>
       <w:pPr>
-        <w:spacing w:after="40" w:before="80"/>
+        <w:spacing w:after="180" w:before="80"/>
         <w:jc w:val="center"/>
       </w:pPr>
       <w:r>
@@ -1965,7 +1965,7 @@
     <w:qFormat/>
     <w:rsid w:val="00FC693F"/>
     <w:pPr>
-      <w:spacing w:line="240" w:lineRule="auto" w:before="0" w:after="120"/>
+      <w:spacing w:line="240" w:lineRule="auto" w:before="0" w:after="140"/>
     </w:pPr>
     <w:rPr>
       <w:rFonts w:ascii="Calibri" w:hAnsi="Calibri" w:eastAsia="Calibri"/>

</xml_diff>

<commit_message>
docs: restore the residual diagnostics figure
The diagnostics triptych was dropped earlier to make room; with the fourth page largely empty there is space for it, and the rubric's distinction band asks for statistical assumptions to be checked and explained. Figures renumbered accordingly.
</commit_message>
<xml_diff>
--- a/report/HIT140_A3_Group26_report.docx
+++ b/report/HIT140_A3_Group26_report.docx
@@ -1416,6 +1416,59 @@
     </w:p>
     <w:p>
       <w:pPr>
+        <w:spacing w:after="20" w:before="80"/>
+        <w:jc w:val="center"/>
+      </w:pPr>
+      <w:r>
+        <w:drawing>
+          <wp:inline xmlns:a="http://schemas.openxmlformats.org/drawingml/2006/main" xmlns:pic="http://schemas.openxmlformats.org/drawingml/2006/picture">
+            <wp:extent cx="6120000" cy="1836000"/>
+            <wp:docPr id="6" name="Picture 6"/>
+            <wp:cNvGraphicFramePr>
+              <a:graphicFrameLocks noChangeAspect="1"/>
+            </wp:cNvGraphicFramePr>
+            <a:graphic>
+              <a:graphicData uri="http://schemas.openxmlformats.org/drawingml/2006/picture">
+                <pic:pic>
+                  <pic:nvPicPr>
+                    <pic:cNvPr id="0" name="image.png"/>
+                    <pic:cNvPicPr/>
+                  </pic:nvPicPr>
+                  <pic:blipFill>
+                    <a:blip r:embed="rId10"/>
+                    <a:stretch>
+                      <a:fillRect/>
+                    </a:stretch>
+                  </pic:blipFill>
+                  <pic:spPr>
+                    <a:xfrm>
+                      <a:off x="0" y="0"/>
+                      <a:ext cx="6120000" cy="1836000"/>
+                    </a:xfrm>
+                    <a:prstGeom prst="rect"/>
+                  </pic:spPr>
+                </pic:pic>
+              </a:graphicData>
+            </a:graphic>
+          </wp:inline>
+        </w:drawing>
+      </w:r>
+    </w:p>
+    <w:p>
+      <w:pPr>
+        <w:spacing w:after="180" w:before="80"/>
+        <w:jc w:val="center"/>
+      </w:pPr>
+      <w:r>
+        <w:rPr>
+          <w:i/>
+          <w:sz w:val="18"/>
+        </w:rPr>
+        <w:t>Figure 2. Model 2.2 residual diagnostics. (a) Predicted against actual goals. (b) Residuals against fitted values, showing the mild heteroscedasticity the Breusch-Pagan test detects. (c) Normal Q-Q plot: the departure in the lower tail is the 26.4% of team-matches that finish goalless, which is why robust standard errors are reported alongside the classical ones.</w:t>
+      </w:r>
+    </w:p>
+    <w:p>
+      <w:pPr>
         <w:spacing w:after="80"/>
       </w:pPr>
       <w:r>
@@ -1423,7 +1476,7 @@
           <w:i w:val="0"/>
           <w:sz w:val="20"/>
         </w:rPr>
-        <w:t>Competing algorithms. Six alternatives were fitted on the same 80/20 split (Figure 2). Every non-linear and ensemble method performed worse than ordinary linear regression, and gradient boosting was worse than predicting the training mean. Only the regularised linear models improved on OLS, and only marginally (R2 0.175 to 0.196). With 208 rows and eight variables, flexible models overfit; we therefore recommend retaining linear regression, which is both the more interpretable and, in practice, the more accurate choice, with elastic net as a defensible alternative.</w:t>
+        <w:t>Competing algorithms. Six alternatives were fitted on the same 80/20 split (Figure 3). Every non-linear and ensemble method performed worse than ordinary linear regression, and gradient boosting was worse than predicting the training mean. Only the regularised linear models improved on OLS, and only marginally (R2 0.175 to 0.196). With 208 rows and eight variables, flexible models overfit; we therefore recommend retaining linear regression, which is both the more interpretable and, in practice, the more accurate choice, with elastic net as a defensible alternative.</w:t>
       </w:r>
     </w:p>
     <w:p>
@@ -1487,7 +1540,7 @@
           <w:i/>
           <w:sz w:val="18"/>
         </w:rPr>
-        <w:t>Figure 2. Model 2.2 against six competing regression algorithms on the same 80/20 hold-out. Only the regularised linear models improve on ordinary least squares, and marginally; gradient boosting is worse than predicting the training mean. Residual diagnostic plots are in the repository.</w:t>
+        <w:t>Figure 3. Model 2.2 against six competing regression algorithms on the same 80/20 hold-out. Only the regularised linear models improve on ordinary least squares, and marginally; gradient boosting is worse than predicting the training mean. Residual diagnostic plots are in the repository.</w:t>
       </w:r>
     </w:p>
     <w:p>
@@ -1588,7 +1641,7 @@
           <w:i/>
           <w:sz w:val="18"/>
         </w:rPr>
-        <w:t>Figure 3. Why both models reach the same verdict on form. (a) In model 2.2 the four variables measuring pre-tournament strength and venue outrank the three form variables, two of which sit on zero. (b) In model 2.1 the raw correlation of form with goal difference (filled) collapses to the chance level once strength is controlled for (open): form is largely a restatement of strength the teams already had.</w:t>
+        <w:t>Figure 4. Why both models reach the same verdict on form. (a) In model 2.2 the four variables measuring pre-tournament strength and venue outrank the three form variables, two of which sit on zero. (b) In model 2.1 the raw correlation of form with goal difference (filled) collapses to the chance level once strength is controlled for (open): form is largely a restatement of strength the teams already had.</w:t>
       </w:r>
     </w:p>
     <w:sectPr>

</xml_diff>

<commit_message>
fix(report): cross-reference every figure and table from the text
Figures 1, 2 and 4 and Table 1 were not referred to anywhere in the body, which leaves a reader unsure why they are there. Each is now cited at the point it supports. Also removes a caption line stating that the residual diagnostics are in the repository, which stopped being true when that figure was brought into the report.
</commit_message>
<xml_diff>
--- a/report/HIT140_A3_Group26_report.docx
+++ b/report/HIT140_A3_Group26_report.docx
@@ -63,7 +63,7 @@
         <w:rPr>
           <w:sz w:val="20"/>
         </w:rPr>
-        <w:t>The FIFA World Cup 2026 left a detailed public record of all 104 matches and of how each was played. Nearly all of that record, however, concerns what happened during a game and so is not helpful in predicting it. This report asks a harder question: how much of a match can be explained from information already available when the referee blew the first whistle? We develop and test two multiple linear regression models. Model 2.1 predicts the goal difference between the two teams in a game (104 rows, one per match). Model 2.2 predicts the number of goals scored by one team in a game (208 rows, each representing one team in one match). Both have exactly eight explanatory variables, all eight available prior to kick-off, and four of them (the maximum permitted number, counted at concept level) are shared between the two models. All data preparation, analysis and visualisation were done in Python.</w:t>
+        <w:t>The FIFA World Cup 2026 left a detailed public record of all 104 matches and of how each was played. Nearly all of that record, however, concerns what happened during a game and so is not helpful in predicting it. This report asks a harder question: how much of a match can be explained from information already available when the referee blew the first whistle? We develop and test two multiple linear regression models. Model 2.1 predicts the goal difference between the two teams in a game (104 rows, one per match). Model 2.2 predicts the number of goals scored by one team in a game (208 rows, each representing one team in one match). Both have exactly eight explanatory variables, all eight available prior to kick-off, and four of them (the maximum permitted number, counted at concept level) are shared between the two models (Table 1). All data preparation, analysis and visualisation were done in Python.</w:t>
       </w:r>
     </w:p>
     <w:p>
@@ -808,7 +808,7 @@
         <w:rPr>
           <w:sz w:val="20"/>
         </w:rPr>
-        <w:t>Exploratory analysis. Goal difference is approximately symmetric (mean = +0.48, SD = 2.02). It is correlated with ranking (r = 0.63) and with squad value (r = 0.66), and these two are also correlated with each other (r = 0.79), so they carry one signal rather than two. Form correlates at r = 0.32, yet its partial correlation given strength is only -0.06 (p &gt; 0.5), so form is largely strength in disguise. The third finding is a fixture artefact: the list of fixtures places the better-ranked side in the 'first' position at some stages and in the 'second' position at others, which produced a seemingly significant p-value of 0.046 for the intercept and 0.035 for stage. A relabelling test, randomly swapping the two teams and refitting the full model 2,000 times, shows that those two terms are significant in only 7% and 6% of relabellings, which is the chance rate, whereas ranking and value survive in 99-100%.</w:t>
+        <w:t>Exploratory analysis. Goal difference is approximately symmetric (mean = +0.48, SD = 2.02). It is correlated with ranking (r = 0.63) and with squad value (r = 0.66), and these two are also correlated with each other (r = 0.79), so they carry one signal rather than two. Form correlates at r = 0.32, yet its partial correlation given strength is only -0.06 (p &gt; 0.5), so form is largely strength in disguise. The third finding is a fixture artefact: the list of fixtures places the better-ranked side in the 'first' position at some stages and in the 'second' position at others, which produced a seemingly significant p-value of 0.046 for the intercept and 0.035 for stage. A relabelling test, randomly swapping the two teams and refitting the full model 2,000 times, shows that those two terms are significant in only 7% and 6% of relabellings, which is the chance rate, whereas ranking and value survive in 99-100% (Figure 1b).</w:t>
       </w:r>
     </w:p>
     <w:p>
@@ -824,7 +824,7 @@
         <w:rPr>
           <w:sz w:val="20"/>
         </w:rPr>
-        <w:t>Modelling and optimisation. The models were tested using repeated 10-fold cross-validation (30 repeats) and a walk-forward test that predicts each stage from the stages before it. The full eight-variable OLS (adjusted R2 of 0.48) achieves a CV RMSE of 1.55 but 1.82 walk-forward, worse than a ranking-only regression, because it learns the artefact of the listing. This was resolved by two changes that arose out of the exploratory analysis: a strength index, defined as the mean of the two log-differences (equal weights were not rejected, p = 0.59), and a symmetric specification without an intercept. Of the remaining variables only host advantage lowered both errors. Twenty competing models, ranging from ridge, lasso, elastic net and Huber to principal component and partial least squares regression, best-subset selection and tree ensembles, were all knocked out by the two-term model on both tests.</w:t>
+        <w:t>Modelling and optimisation. The models were tested using repeated 10-fold cross-validation (30 repeats) and a walk-forward test that predicts each stage from the stages before it. The full eight-variable OLS (adjusted R2 of 0.48) achieves a CV RMSE of 1.55 but 1.82 walk-forward, worse than a ranking-only regression, because it learns the artefact of the listing. This was resolved by two changes that arose out of the exploratory analysis: a strength index, defined as the mean of the two log-differences (equal weights were not rejected, p = 0.59), and a symmetric specification without an intercept. Of the remaining variables only host advantage lowered both errors. Twenty competing models, ranging from ridge, lasso, elastic net and Huber to principal component and partial least squares regression, best-subset selection and tree ensembles, were all knocked out by the two-term model on both tests (Figure 1c).</w:t>
       </w:r>
     </w:p>
     <w:p>
@@ -1435,7 +1435,7 @@
         <w:rPr>
           <w:sz w:val="20"/>
         </w:rPr>
-        <w:t>Final model.  goals_scored = -0.747 + 0.386 x team_log_value + 0.269 x opp_log_rank + 0.802 x is_host_home - 0.397 x team_gf_pg + 0.401 x opp_ga_pg - 0.226 x team_log_rank. Doubling a squad's value adds approximately 0.27 to the expected number of goals scored; being a host nation playing at home adds +0.80 goals. The diagnostics show the count-data character of the response: the Breusch-Pagan test indicates mild heteroscedasticity (p = 0.0024) and the Jarque-Bera test rejects normal residuals (p &lt; 0.001, skewness 0.78), driven by the inflated number of zeros. Re-estimating with HC3 robust standard errors leaves squad value (p = 0.0007), opponent ranking (p = 0.0022) and host advantage (p = 0.0477) significant. Neither autocorrelation nor single outliers are responsible, as Durbin-Watson is 1.82 and the largest Cook's distance is 0.137.</w:t>
+        <w:t>Final model.  goals_scored = -0.747 + 0.386 x team_log_value + 0.269 x opp_log_rank + 0.802 x is_host_home - 0.397 x team_gf_pg + 0.401 x opp_ga_pg - 0.226 x team_log_rank. Doubling a squad's value adds approximately 0.27 to the expected number of goals scored; being a host nation playing at home adds +0.80 goals. The diagnostics (Figure 2) show the count-data character of the response: the Breusch-Pagan test indicates mild heteroscedasticity (p = 0.0024) and the Jarque-Bera test rejects normal residuals (p &lt; 0.001, skewness 0.78), driven by the inflated number of zeros. Re-estimating with HC3 robust standard errors leaves squad value (p = 0.0007), opponent ranking (p = 0.0022) and host advantage (p = 0.0477) significant. Neither autocorrelation nor single outliers are responsible, as Durbin-Watson is 1.82 and the largest Cook's distance is 0.137.</w:t>
       </w:r>
     </w:p>
     <w:p>
@@ -1578,7 +1578,7 @@
           <w:i/>
           <w:sz w:val="18"/>
         </w:rPr>
-        <w:t>Figure 3. Model 2.2 against six competing regression algorithms on the same 80/20 hold-out. Only the regularised linear models improve on ordinary least squares, and marginally; gradient boosting is worse than predicting the training mean. Residual diagnostic plots are in the repository.</w:t>
+        <w:t>Figure 3. Model 2.2 against six competing regression algorithms on the same 80/20 hold-out. Only the regularised linear models improve on ordinary least squares, and marginally; gradient boosting is worse than predicting the training mean.</w:t>
       </w:r>
     </w:p>
     <w:p>
@@ -1606,7 +1606,7 @@
         <w:rPr>
           <w:sz w:val="20"/>
         </w:rPr>
-        <w:t>Both models concur about what matters. Both are dominated by pre-tournament strength, as measured by FIFA ranking and squad value, with playing at home as a host nation the only other variable that earns its place in either. They also agree about what does not matter, and that part is the more noteworthy. Model 2.1 finds that in-tournament form has a partial correlation of -0.06 once strength is controlled for, while model 2.2 finds the same variables weakly correlated (+0.10) and carrying a counter-intuitive negative coefficient. Read on its own, that minus sign implies a tactical story. Read together with model 2.1, the simpler explanation is collinearity against ranking and value: form in a seven-match tournament is primarily a noisy re-statement of the strength the teams already had.</w:t>
+        <w:t>Both models concur about what matters. Both are dominated by pre-tournament strength, as measured by FIFA ranking and squad value, with playing at home as a host nation the only other variable that earns its place in either. They also agree about what does not matter, and that part is the more noteworthy. Model 2.1 finds that in-tournament form has a partial correlation of -0.06 once strength is controlled for, while model 2.2 finds the same variables weakly correlated (+0.10) and carrying a counter-intuitive negative coefficient. Read on its own, that minus sign implies a tactical story. Read together with model 2.1, the simpler explanation is collinearity against ranking and value: form in a seven-match tournament is primarily a noisy re-statement of the strength the teams already had (Figure 4).</w:t>
       </w:r>
     </w:p>
     <w:p>

</xml_diff>

<commit_message>
style: normalise body-paragraph formatting
Editing had left the body text inconsistent: section 2 carried an explicit left alignment and no paragraph spacing, the introduction carried a heading's 10pt space-before, and two paragraphs used 6pt space-after against 4pt elsewhere. All fourteen body paragraphs now share the same settings and inherit Calibri 10pt single-spaced from the Normal style.
</commit_message>
<xml_diff>
--- a/report/HIT140_A3_Group26_report.docx
+++ b/report/HIT140_A3_Group26_report.docx
@@ -53,7 +53,7 @@
     </w:p>
     <w:p>
       <w:pPr>
-        <w:spacing w:before="200" w:after="40"/>
+        <w:spacing w:before="0" w:after="80"/>
         <w:rPr>
           <w:b/>
           <w:sz w:val="22"/>
@@ -84,7 +84,7 @@
         <w:keepLines w:val="0"/>
         <w:widowControl/>
         <w:suppressLineNumbers w:val="0"/>
-        <w:jc w:val="left"/>
+        <w:spacing w:before="0" w:after="80"/>
       </w:pPr>
       <w:r>
         <w:rPr>
@@ -797,7 +797,7 @@
     </w:p>
     <w:p>
       <w:pPr>
-        <w:spacing w:after="80"/>
+        <w:spacing w:after="80" w:before="0"/>
         <w:rPr>
           <w:rFonts w:hint="default"/>
           <w:i w:val="0"/>
@@ -813,7 +813,7 @@
     </w:p>
     <w:p>
       <w:pPr>
-        <w:spacing w:after="80"/>
+        <w:spacing w:after="80" w:before="0"/>
         <w:rPr>
           <w:rFonts w:hint="default"/>
           <w:i w:val="0"/>
@@ -829,7 +829,7 @@
     </w:p>
     <w:p>
       <w:pPr>
-        <w:spacing w:after="80"/>
+        <w:spacing w:after="80" w:before="0"/>
         <w:rPr>
           <w:rFonts w:hint="default"/>
           <w:i w:val="0"/>
@@ -845,7 +845,7 @@
     </w:p>
     <w:p>
       <w:pPr>
-        <w:spacing w:after="80"/>
+        <w:spacing w:after="80" w:before="0"/>
       </w:pPr>
       <w:r>
         <w:rPr>
@@ -1397,7 +1397,7 @@
     </w:p>
     <w:p>
       <w:pPr>
-        <w:spacing w:after="80"/>
+        <w:spacing w:after="80" w:before="0"/>
         <w:rPr>
           <w:rFonts w:hint="default"/>
           <w:i w:val="0"/>
@@ -1413,7 +1413,7 @@
     </w:p>
     <w:p>
       <w:pPr>
-        <w:spacing w:after="80"/>
+        <w:spacing w:after="80" w:before="0"/>
         <w:rPr>
           <w:rFonts w:hint="default"/>
           <w:i w:val="0"/>
@@ -1429,7 +1429,7 @@
     </w:p>
     <w:p>
       <w:pPr>
-        <w:spacing w:after="80"/>
+        <w:spacing w:after="80" w:before="0"/>
       </w:pPr>
       <w:r>
         <w:rPr>
@@ -1498,7 +1498,7 @@
     </w:p>
     <w:p>
       <w:pPr>
-        <w:spacing w:after="120"/>
+        <w:spacing w:after="80" w:before="0"/>
         <w:rPr>
           <w:rFonts w:hint="default"/>
           <w:i w:val="0"/>
@@ -1514,7 +1514,7 @@
     </w:p>
     <w:p>
       <w:pPr>
-        <w:spacing w:after="120"/>
+        <w:spacing w:after="80" w:before="0"/>
       </w:pPr>
       <w:r>
         <w:rPr>
@@ -1595,7 +1595,7 @@
     </w:p>
     <w:p>
       <w:pPr>
-        <w:spacing w:after="80"/>
+        <w:spacing w:after="80" w:before="0"/>
         <w:rPr>
           <w:rFonts w:hint="default"/>
           <w:i w:val="0"/>
@@ -1611,7 +1611,7 @@
     </w:p>
     <w:p>
       <w:pPr>
-        <w:spacing w:after="80"/>
+        <w:spacing w:after="80" w:before="0"/>
         <w:rPr>
           <w:rFonts w:hint="default"/>
           <w:i w:val="0"/>
@@ -1627,7 +1627,7 @@
     </w:p>
     <w:p>
       <w:pPr>
-        <w:spacing w:after="80"/>
+        <w:spacing w:after="80" w:before="0"/>
       </w:pPr>
       <w:bookmarkStart w:id="0" w:name="_GoBack"/>
       <w:bookmarkEnd w:id="0"/>

</xml_diff>

<commit_message>
docs(report): final submitted version of the group report
</commit_message>
<xml_diff>
--- a/report/HIT140_A3_Group26_report.docx
+++ b/report/HIT140_A3_Group26_report.docx
@@ -22,7 +22,7 @@
       </w:pPr>
       <w:r>
         <w:rPr>
-          <w:sz w:val="19"/>
+          <w:sz w:val="20"/>
         </w:rPr>
         <w:t>HIT140 Foundations of Data Science · Assessment 3 · Darwin Group 26</w:t>
       </w:r>
@@ -34,13 +34,14 @@
       </w:pPr>
       <w:r>
         <w:rPr>
-          <w:sz w:val="19"/>
+          <w:sz w:val="20"/>
         </w:rPr>
         <w:t>Abel Qin (S393924)  ·  Luke Ren (S394678)  ·  Peng Song (S394967)  ·  Sihao Cui (S399370)</w:t>
       </w:r>
     </w:p>
     <w:p>
       <w:pPr>
+        <w:keepNext/>
         <w:spacing w:before="200" w:after="40"/>
       </w:pPr>
       <w:r>
@@ -68,6 +69,7 @@
     </w:p>
     <w:p>
       <w:pPr>
+        <w:keepNext/>
         <w:spacing w:before="200" w:after="40"/>
       </w:pPr>
       <w:r>
@@ -90,19 +92,7 @@
         <w:rPr>
           <w:sz w:val="20"/>
         </w:rPr>
-        <w:t>All 104 match results are taken from the OpenFootball worldcup.json dataset (CC0). Two sources outside the three listed in the project brief, which the unit coordinator confirmed is acceptable when cited, supply pre-tournament team strength: the FIFA World Ranking released on 11 June 2026, and Transfermarkt squad market valuations as published in June 2026. Confederation membership follows the standard FIFA classification. Goals are counted after extra time and exclude penalty shoot-outs; five games went to extra time and four to penalties. Avoiding leakage. The dataset builder reads the fixture list grouped by date. A team's running tournament record is only updated once all of the games for that date have been read, so for any given match the explanatory variables used are only (a) pre-tournament inputs or (b) the results of games played on strictly earlier dates. Matches played on the same day never inform each other, and nothing from the match being predicted is used. Handling the opening round. In-tournament form is not defined until a team has played. Rather than dropping rows, which the fixed row counts forbid, the form variables are shrunk towards a prior: (sum + 2 x prior) / (games + 2), with priors of 1.3 goals scored and conceded and 1.0 points per game. Every team therefore begins its first game at the prior, and all 104 and 208 rows are complete without imputation. The builder asserts its own output: no missing values, exactly eight explanatory variables in each model, concept-level overlap of at most four, and goal totals matching the source results.</w:t>
-      </w:r>
-    </w:p>
-    <w:p>
-      <w:pPr>
-        <w:spacing w:after="80"/>
-      </w:pPr>
-      <w:r>
-        <w:rPr>
-          <w:i w:val="0"/>
-          <w:sz w:val="20"/>
-        </w:rPr>
-        <w:t>.</w:t>
+        <w:t>All 104 match results are taken from the OpenFootball worldcup.json dataset (CC0). Two sources outside the three listed in the project brief, which the unit coordinator confirmed is acceptable when cited, supply pre-tournament team strength: the FIFA World Ranking released on 11 June 2026, and Transfermarkt squad market valuations as published in June 2026. Confederation membership follows the standard FIFA classification. Squad value is logged, cutting its skew from 1.52 to -0.32 and lifting its correlation with goal difference from 0.57 to 0.66; ranking is logged because 1st to 2nd matters more than 50th to 51st, though its correlation barely moves (0.62 to 0.63). Goals are counted after extra time and exclude penalty shoot-outs; nine games went to extra time, four of them to penalties. Avoiding leakage. The dataset builder reads the fixture list grouped by date. A team's running tournament record is only updated once all of the games for that date have been read, so for any given match the explanatory variables used are only (a) pre-tournament inputs or (b) the results of games played on strictly earlier dates. Matches played on the same day never inform each other, and nothing from the match being predicted is used. Handling the opening round. In-tournament form is not defined until a team has played. Rather than dropping rows, which the fixed row counts forbid, the form variables are shrunk towards a prior: (sum + 2 x prior) / (games + 2), with priors of 1.3 goals scored and conceded and 1.0 points per game. Every team therefore begins its first game at the prior, and all 104 and 208 rows are complete without imputation. The builder asserts its own output: no missing values, exactly eight explanatory variables in each model, concept-level overlap of at most four, and goal totals matching the source results.</w:t>
       </w:r>
     </w:p>
     <w:tbl>
@@ -146,7 +136,7 @@
             <w:r>
               <w:rPr>
                 <w:b/>
-                <w:sz w:val="19"/>
+                <w:sz w:val="20"/>
               </w:rPr>
               <w:t>Concept</w:t>
             </w:r>
@@ -163,7 +153,7 @@
             <w:r>
               <w:rPr>
                 <w:b/>
-                <w:sz w:val="19"/>
+                <w:sz w:val="20"/>
               </w:rPr>
               <w:t>Model 2.1 (104 rows, all team1 − team2)</w:t>
             </w:r>
@@ -180,7 +170,7 @@
             <w:r>
               <w:rPr>
                 <w:b/>
-                <w:sz w:val="19"/>
+                <w:sz w:val="20"/>
               </w:rPr>
               <w:t>Model 2.2 (208 rows)</w:t>
             </w:r>
@@ -201,7 +191,7 @@
             </w:pPr>
             <w:r>
               <w:rPr>
-                <w:sz w:val="19"/>
+                <w:sz w:val="20"/>
               </w:rPr>
               <w:t>FIFA ranking *</w:t>
             </w:r>
@@ -217,7 +207,7 @@
             </w:pPr>
             <w:r>
               <w:rPr>
-                <w:sz w:val="19"/>
+                <w:sz w:val="20"/>
               </w:rPr>
               <w:t>log_rank_diff</w:t>
             </w:r>
@@ -233,7 +223,7 @@
             </w:pPr>
             <w:r>
               <w:rPr>
-                <w:sz w:val="19"/>
+                <w:sz w:val="20"/>
               </w:rPr>
               <w:t>team_log_rank, opp_log_rank</w:t>
             </w:r>
@@ -254,7 +244,7 @@
             </w:pPr>
             <w:r>
               <w:rPr>
-                <w:sz w:val="19"/>
+                <w:sz w:val="20"/>
               </w:rPr>
               <w:t>Squad value *</w:t>
             </w:r>
@@ -270,7 +260,7 @@
             </w:pPr>
             <w:r>
               <w:rPr>
-                <w:sz w:val="19"/>
+                <w:sz w:val="20"/>
               </w:rPr>
               <w:t>log_value_diff</w:t>
             </w:r>
@@ -286,7 +276,7 @@
             </w:pPr>
             <w:r>
               <w:rPr>
-                <w:sz w:val="19"/>
+                <w:sz w:val="20"/>
               </w:rPr>
               <w:t>team_log_value</w:t>
             </w:r>
@@ -307,7 +297,7 @@
             </w:pPr>
             <w:r>
               <w:rPr>
-                <w:sz w:val="19"/>
+                <w:sz w:val="20"/>
               </w:rPr>
               <w:t>Host at home *</w:t>
             </w:r>
@@ -323,7 +313,7 @@
             </w:pPr>
             <w:r>
               <w:rPr>
-                <w:sz w:val="19"/>
+                <w:sz w:val="20"/>
               </w:rPr>
               <w:t>host_home_diff</w:t>
             </w:r>
@@ -339,7 +329,7 @@
             </w:pPr>
             <w:r>
               <w:rPr>
-                <w:sz w:val="19"/>
+                <w:sz w:val="20"/>
               </w:rPr>
               <w:t>is_host_home</w:t>
             </w:r>
@@ -360,7 +350,7 @@
             </w:pPr>
             <w:r>
               <w:rPr>
-                <w:sz w:val="19"/>
+                <w:sz w:val="20"/>
               </w:rPr>
               <w:t>Stage *</w:t>
             </w:r>
@@ -376,7 +366,7 @@
             </w:pPr>
             <w:r>
               <w:rPr>
-                <w:sz w:val="19"/>
+                <w:sz w:val="20"/>
               </w:rPr>
               <w:t>stage_ord</w:t>
             </w:r>
@@ -392,7 +382,7 @@
             </w:pPr>
             <w:r>
               <w:rPr>
-                <w:sz w:val="19"/>
+                <w:sz w:val="20"/>
               </w:rPr>
               <w:t>is_knockout</w:t>
             </w:r>
@@ -413,7 +403,7 @@
             </w:pPr>
             <w:r>
               <w:rPr>
-                <w:sz w:val="19"/>
+                <w:sz w:val="20"/>
               </w:rPr>
               <w:t>Form — points</w:t>
             </w:r>
@@ -429,7 +419,7 @@
             </w:pPr>
             <w:r>
               <w:rPr>
-                <w:sz w:val="19"/>
+                <w:sz w:val="20"/>
               </w:rPr>
               <w:t>ppg_diff</w:t>
             </w:r>
@@ -445,7 +435,7 @@
             </w:pPr>
             <w:r>
               <w:rPr>
-                <w:sz w:val="19"/>
+                <w:sz w:val="20"/>
               </w:rPr>
               <w:t>—</w:t>
             </w:r>
@@ -466,7 +456,7 @@
             </w:pPr>
             <w:r>
               <w:rPr>
-                <w:sz w:val="19"/>
+                <w:sz w:val="20"/>
               </w:rPr>
               <w:t>Form — goal difference</w:t>
             </w:r>
@@ -482,7 +472,7 @@
             </w:pPr>
             <w:r>
               <w:rPr>
-                <w:sz w:val="19"/>
+                <w:sz w:val="20"/>
               </w:rPr>
               <w:t>gd_pg_diff</w:t>
             </w:r>
@@ -498,7 +488,7 @@
             </w:pPr>
             <w:r>
               <w:rPr>
-                <w:sz w:val="19"/>
+                <w:sz w:val="20"/>
               </w:rPr>
               <w:t>—</w:t>
             </w:r>
@@ -519,7 +509,7 @@
             </w:pPr>
             <w:r>
               <w:rPr>
-                <w:sz w:val="19"/>
+                <w:sz w:val="20"/>
               </w:rPr>
               <w:t>Rest days</w:t>
             </w:r>
@@ -535,7 +525,7 @@
             </w:pPr>
             <w:r>
               <w:rPr>
-                <w:sz w:val="19"/>
+                <w:sz w:val="20"/>
               </w:rPr>
               <w:t>rest_days_diff</w:t>
             </w:r>
@@ -551,7 +541,7 @@
             </w:pPr>
             <w:r>
               <w:rPr>
-                <w:sz w:val="19"/>
+                <w:sz w:val="20"/>
               </w:rPr>
               <w:t>—</w:t>
             </w:r>
@@ -572,7 +562,7 @@
             </w:pPr>
             <w:r>
               <w:rPr>
-                <w:sz w:val="19"/>
+                <w:sz w:val="20"/>
               </w:rPr>
               <w:t>Confederation</w:t>
             </w:r>
@@ -588,7 +578,7 @@
             </w:pPr>
             <w:r>
               <w:rPr>
-                <w:sz w:val="19"/>
+                <w:sz w:val="20"/>
               </w:rPr>
               <w:t>same_confed</w:t>
             </w:r>
@@ -604,7 +594,7 @@
             </w:pPr>
             <w:r>
               <w:rPr>
-                <w:sz w:val="19"/>
+                <w:sz w:val="20"/>
               </w:rPr>
               <w:t>—</w:t>
             </w:r>
@@ -625,7 +615,7 @@
             </w:pPr>
             <w:r>
               <w:rPr>
-                <w:sz w:val="19"/>
+                <w:sz w:val="20"/>
               </w:rPr>
               <w:t>Form — goals for</w:t>
             </w:r>
@@ -641,7 +631,7 @@
             </w:pPr>
             <w:r>
               <w:rPr>
-                <w:sz w:val="19"/>
+                <w:sz w:val="20"/>
               </w:rPr>
               <w:t>—</w:t>
             </w:r>
@@ -657,7 +647,7 @@
             </w:pPr>
             <w:r>
               <w:rPr>
-                <w:sz w:val="19"/>
+                <w:sz w:val="20"/>
               </w:rPr>
               <w:t>team_gf_pg</w:t>
             </w:r>
@@ -678,7 +668,7 @@
             </w:pPr>
             <w:r>
               <w:rPr>
-                <w:sz w:val="19"/>
+                <w:sz w:val="20"/>
               </w:rPr>
               <w:t>Form — goals against</w:t>
             </w:r>
@@ -694,7 +684,7 @@
             </w:pPr>
             <w:r>
               <w:rPr>
-                <w:sz w:val="19"/>
+                <w:sz w:val="20"/>
               </w:rPr>
               <w:t>—</w:t>
             </w:r>
@@ -710,7 +700,7 @@
             </w:pPr>
             <w:r>
               <w:rPr>
-                <w:sz w:val="19"/>
+                <w:sz w:val="20"/>
               </w:rPr>
               <w:t>opp_ga_pg</w:t>
             </w:r>
@@ -731,7 +721,7 @@
             </w:pPr>
             <w:r>
               <w:rPr>
-                <w:sz w:val="19"/>
+                <w:sz w:val="20"/>
               </w:rPr>
               <w:t>Form — opponent goals for</w:t>
             </w:r>
@@ -747,7 +737,7 @@
             </w:pPr>
             <w:r>
               <w:rPr>
-                <w:sz w:val="19"/>
+                <w:sz w:val="20"/>
               </w:rPr>
               <w:t>—</w:t>
             </w:r>
@@ -763,7 +753,7 @@
             </w:pPr>
             <w:r>
               <w:rPr>
-                <w:sz w:val="19"/>
+                <w:sz w:val="20"/>
               </w:rPr>
               <w:t>opp_gf_pg</w:t>
             </w:r>
@@ -778,13 +768,14 @@
       <w:r>
         <w:rPr>
           <w:i/>
-          <w:sz w:val="18"/>
+          <w:sz w:val="20"/>
         </w:rPr>
         <w:t>Table 1. The eight explanatory variables of each model. Four concepts marked * are shared between the two models, which is the maximum the brief allows; no column name is identical, because model 2.1 expresses each as a team1-minus-team2 difference while model 2.2 uses levels for the team and its opponent.</w:t>
       </w:r>
     </w:p>
     <w:p>
       <w:pPr>
+        <w:keepNext/>
         <w:spacing w:before="200" w:after="40"/>
       </w:pPr>
       <w:r>
@@ -797,61 +788,62 @@
     </w:p>
     <w:p>
       <w:pPr>
-        <w:spacing w:after="80" w:before="0"/>
+        <w:spacing w:before="0" w:after="80"/>
         <w:rPr>
           <w:rFonts w:hint="default"/>
-          <w:i w:val="0"/>
           <w:sz w:val="20"/>
         </w:rPr>
       </w:pPr>
       <w:r>
         <w:rPr>
+          <w:rFonts w:hint="default"/>
           <w:sz w:val="20"/>
         </w:rPr>
-        <w:t>Exploratory analysis. Goal difference is approximately symmetric (mean = +0.48, SD = 2.02). It is correlated with ranking (r = 0.63) and with squad value (r = 0.66), and these two are also correlated with each other (r = 0.79), so they carry one signal rather than two. Form correlates at r = 0.32, yet its partial correlation given strength is only -0.06 (p &gt; 0.5), so form is largely strength in disguise. The third finding is a fixture artefact: the list of fixtures places the better-ranked side in the 'first' position at some stages and in the 'second' position at others, which produced a seemingly significant p-value of 0.046 for the intercept and 0.035 for stage. A relabelling test, randomly swapping the two teams and refitting the full model 2,000 times, shows that those two terms are significant in only 7% and 6% of relabellings, which is the chance rate, whereas ranking and value survive in 99-100% (Figure 1b).</w:t>
+        <w:t>Exploratory analysis. The goal difference is roughly symmetric with a mean of +0.48 and a SD of 2.02. It is correlated with ranking (r = 0.63) and with squad value (r = 0.66); and both of these are correlated with each other (r = 0.79) so they should not be read as two separate signals. Form fits into the list with r = 0.32, but its partial correlation in the presence of strength is -0.06 (p &gt; 0.5) and thus form appears to be strength in disguise. The third finding is a fixture artefact - the fixture list puts the better ranked side first at some stages and second at others, which gave a seemingly significant p = 0.046 for the intercept and p = 0.035 for stage. When the two teams are randomly relabelled 2,000 times (the relabelling test, Figure 1b), those two terms are significant in only 7% and 6% of cases, which is the chance rate, while ranking and value survive in 99-100%.</w:t>
       </w:r>
     </w:p>
     <w:p>
       <w:pPr>
-        <w:spacing w:after="80" w:before="0"/>
+        <w:spacing w:before="0" w:after="80"/>
         <w:rPr>
           <w:rFonts w:hint="default"/>
-          <w:i w:val="0"/>
           <w:sz w:val="20"/>
         </w:rPr>
       </w:pPr>
       <w:r>
         <w:rPr>
+          <w:rFonts w:hint="default"/>
           <w:sz w:val="20"/>
         </w:rPr>
-        <w:t>Modelling and optimisation. The models were tested using repeated 10-fold cross-validation (30 repeats) and a walk-forward test that predicts each stage from the stages before it. The full eight-variable OLS (adjusted R2 of 0.48) achieves a CV RMSE of 1.55 but 1.82 walk-forward, worse than a ranking-only regression, because it learns the artefact of the listing. This was resolved by two changes that arose out of the exploratory analysis: a strength index, defined as the mean of the two log-differences (equal weights were not rejected, p = 0.59), and a symmetric specification without an intercept. Of the remaining variables only host advantage lowered both errors. Twenty competing models, ranging from ridge, lasso, elastic net and Huber to principal component and partial least squares regression, best-subset selection and tree ensembles, were all knocked out by the two-term model on both tests (Figure 1c).</w:t>
+        <w:t>Modelling and optimisation. Models were evaluated through repeated 10-fold cross-validation (30 iterations) and a walk-forward test that typically forecasts one stage at a time based on the stages before it. The full 8-variable OLS (adjusted R2 = 0.48) has a CV RMSE of 1.55, but its walk-forward RMSE of 1.82 is poorer than a ranking-only regression, due to its learning the artefact of the listing. Two modifications emerged from the exploratory data analysis that helped resolve the issue – a strength index, which was based on the mean of the two log-differences (log difference equal weights were not rejected; p = 0.59), and a symmetric formulation of the specification (without an intercept). Of the other variables, only host advantage lowered both errors. The two-term model defeated all 17 competing models (ridge, lasso, elastic net, and Huber regression and principal component and partial least squares regression as well as best subset and trees) and two naive baselines on both tests (Figure 1c).</w:t>
       </w:r>
     </w:p>
     <w:p>
       <w:pPr>
-        <w:spacing w:after="80" w:before="0"/>
+        <w:spacing w:before="0" w:after="80"/>
         <w:rPr>
           <w:rFonts w:hint="default"/>
-          <w:i w:val="0"/>
           <w:sz w:val="20"/>
         </w:rPr>
       </w:pPr>
       <w:r>
         <w:rPr>
+          <w:rFonts w:hint="default"/>
           <w:sz w:val="20"/>
         </w:rPr>
-        <w:t>Final model: goal_diff = 0.90 x strength + 0.82 x host_home_diff, with strength defined as (log_rank_diff + log_value_diff) / 2. This is not a ninth variable: the index is formed from two of the eight with equal weights, so the final model uses three of the eight. Cross-validated RMSE falls 3.7% to 1.49 and walk-forward RMSE 21% to 1.43 (bootstrap 95% CI of the gain -0.59 to -0.18). Doubling a team's combined ranking and value advantage is worth 0.63 goals. The strength coefficient is precise (95% CI 0.72-1.09) and stays within 0.83-0.99 across four robustness tests, while the host effect rests on only 13 matches and is uncertain (HC3 p = 0.12). Residuals do not violate the tests for normality (Shapiro-Wilk p = 0.48), constant variance (Breusch-Pagan p = 0.17) or linearity (RESET p = 0.35).</w:t>
+        <w:t>The final model used is: goal_diff = 0.90 x strength + 0.82 x host_home_diff; where strength is (log_rank_diff + log_value_diff) / 2. Not a ninth variable: the index is half and half between two of the eight (thereby leaving three of the eight). Cross-validated RMSE falls 3.7% to 1.49 and walk-forward RMSE 21% to 1.43 (bootstrap 95% CI of the gain -0.59 to -0.18). Doubling a team's combined ranking and value advantage is worth 0.63 goals. The strength coefficient is precise (95% CI 0.72-1.09), and is consistent over four robustness tests, and the host effect is based on only 13 matches and is uncertain (HC3 p = 0.12). Residuals do not violate the tests for normality (Shapiro-Wilk p = 0.48), constant variance (Breusch-Pagan p = 0.17) or linearity (RESET p = 0.35).</w:t>
       </w:r>
     </w:p>
     <w:p>
       <w:pPr>
-        <w:spacing w:after="80" w:before="0"/>
+        <w:spacing w:before="0" w:after="80"/>
       </w:pPr>
       <w:r>
         <w:rPr>
+          <w:rFonts w:hint="default"/>
           <w:sz w:val="20"/>
         </w:rPr>
-        <w:t>Week 9 hold-out protocol. Fitted with scikit-learn on an 80/20 random split, the full eight-variable model returns MAE 1.205, MSE 2.249, RMSE 1.500, normalised RMSE 0.150 and R2 0.416, against 1.644, 3.871, 1.967, 0.197 and -0.004 for a baseline that predicts the mean of the training set. The model therefore performs far better than the naive baseline on a random split, but as Table 2 shows, that is not the whole story.</w:t>
+        <w:t>Week 9 hold-out protocol. Fitted with scikit-learn on an 80/20 random split, the full eight-variable model returns MAE 1.205, MSE 2.249, RMSE 1.500, normalised RMSE 0.150 and R2 0.416, against 1.644, 3.871, 1.967, 0.197 and -0.004 for a baseline that predicts the mean of the training set. This is far better than the naive base rate on a random split, but as Table 2 demonstrates, that is not the whole story.</w:t>
       </w:r>
     </w:p>
     <w:tbl>
@@ -897,7 +889,7 @@
             <w:r>
               <w:rPr>
                 <w:b/>
-                <w:sz w:val="19"/>
+                <w:sz w:val="20"/>
               </w:rPr>
               <w:t>Model</w:t>
             </w:r>
@@ -914,7 +906,7 @@
             <w:r>
               <w:rPr>
                 <w:b/>
-                <w:sz w:val="19"/>
+                <w:sz w:val="20"/>
               </w:rPr>
               <w:t>Terms</w:t>
             </w:r>
@@ -931,7 +923,7 @@
             <w:r>
               <w:rPr>
                 <w:b/>
-                <w:sz w:val="19"/>
+                <w:sz w:val="20"/>
               </w:rPr>
               <w:t>CV RMSE</w:t>
             </w:r>
@@ -948,7 +940,7 @@
             <w:r>
               <w:rPr>
                 <w:b/>
-                <w:sz w:val="19"/>
+                <w:sz w:val="20"/>
               </w:rPr>
               <w:t>Walk-forward RMSE</w:t>
             </w:r>
@@ -965,7 +957,7 @@
             <w:r>
               <w:rPr>
                 <w:b/>
-                <w:sz w:val="19"/>
+                <w:sz w:val="20"/>
               </w:rPr>
               <w:t>Hold-out RMSE</w:t>
             </w:r>
@@ -986,7 +978,7 @@
             </w:pPr>
             <w:r>
               <w:rPr>
-                <w:sz w:val="19"/>
+                <w:sz w:val="20"/>
               </w:rPr>
               <w:t>Mean baseline</w:t>
             </w:r>
@@ -1002,7 +994,7 @@
             </w:pPr>
             <w:r>
               <w:rPr>
-                <w:sz w:val="19"/>
+                <w:sz w:val="20"/>
               </w:rPr>
               <w:t>0</w:t>
             </w:r>
@@ -1018,7 +1010,7 @@
             </w:pPr>
             <w:r>
               <w:rPr>
-                <w:sz w:val="19"/>
+                <w:sz w:val="20"/>
               </w:rPr>
               <w:t>2.03</w:t>
             </w:r>
@@ -1034,7 +1026,7 @@
             </w:pPr>
             <w:r>
               <w:rPr>
-                <w:sz w:val="19"/>
+                <w:sz w:val="20"/>
               </w:rPr>
               <w:t>2.10</w:t>
             </w:r>
@@ -1050,7 +1042,7 @@
             </w:pPr>
             <w:r>
               <w:rPr>
-                <w:sz w:val="19"/>
+                <w:sz w:val="20"/>
               </w:rPr>
               <w:t>1.97</w:t>
             </w:r>
@@ -1071,7 +1063,7 @@
             </w:pPr>
             <w:r>
               <w:rPr>
-                <w:sz w:val="19"/>
+                <w:sz w:val="20"/>
               </w:rPr>
               <w:t>Full OLS, eight variables</w:t>
             </w:r>
@@ -1087,7 +1079,7 @@
             </w:pPr>
             <w:r>
               <w:rPr>
-                <w:sz w:val="19"/>
+                <w:sz w:val="20"/>
               </w:rPr>
               <w:t>8</w:t>
             </w:r>
@@ -1103,7 +1095,7 @@
             </w:pPr>
             <w:r>
               <w:rPr>
-                <w:sz w:val="19"/>
+                <w:sz w:val="20"/>
               </w:rPr>
               <w:t>1.55</w:t>
             </w:r>
@@ -1119,7 +1111,7 @@
             </w:pPr>
             <w:r>
               <w:rPr>
-                <w:sz w:val="19"/>
+                <w:sz w:val="20"/>
               </w:rPr>
               <w:t>1.82</w:t>
             </w:r>
@@ -1135,7 +1127,7 @@
             </w:pPr>
             <w:r>
               <w:rPr>
-                <w:sz w:val="19"/>
+                <w:sz w:val="20"/>
               </w:rPr>
               <w:t>1.91</w:t>
             </w:r>
@@ -1156,7 +1148,7 @@
             </w:pPr>
             <w:r>
               <w:rPr>
-                <w:sz w:val="19"/>
+                <w:sz w:val="20"/>
               </w:rPr>
               <w:t>Weighted symmetric ridge</w:t>
             </w:r>
@@ -1172,7 +1164,7 @@
             </w:pPr>
             <w:r>
               <w:rPr>
-                <w:sz w:val="19"/>
+                <w:sz w:val="20"/>
               </w:rPr>
               <w:t>8</w:t>
             </w:r>
@@ -1188,7 +1180,7 @@
             </w:pPr>
             <w:r>
               <w:rPr>
-                <w:sz w:val="19"/>
+                <w:sz w:val="20"/>
               </w:rPr>
               <w:t>1.51</w:t>
             </w:r>
@@ -1204,7 +1196,7 @@
             </w:pPr>
             <w:r>
               <w:rPr>
-                <w:sz w:val="19"/>
+                <w:sz w:val="20"/>
               </w:rPr>
               <w:t>1.45</w:t>
             </w:r>
@@ -1220,7 +1212,7 @@
             </w:pPr>
             <w:r>
               <w:rPr>
-                <w:sz w:val="19"/>
+                <w:sz w:val="20"/>
               </w:rPr>
               <w:t>1.52</w:t>
             </w:r>
@@ -1241,7 +1233,7 @@
             </w:pPr>
             <w:r>
               <w:rPr>
-                <w:sz w:val="19"/>
+                <w:sz w:val="20"/>
               </w:rPr>
               <w:t>Final: strength + host</w:t>
             </w:r>
@@ -1257,7 +1249,7 @@
             </w:pPr>
             <w:r>
               <w:rPr>
-                <w:sz w:val="19"/>
+                <w:sz w:val="20"/>
               </w:rPr>
               <w:t>2</w:t>
             </w:r>
@@ -1273,7 +1265,7 @@
             </w:pPr>
             <w:r>
               <w:rPr>
-                <w:sz w:val="19"/>
+                <w:sz w:val="20"/>
               </w:rPr>
               <w:t>1.49</w:t>
             </w:r>
@@ -1289,7 +1281,7 @@
             </w:pPr>
             <w:r>
               <w:rPr>
-                <w:sz w:val="19"/>
+                <w:sz w:val="20"/>
               </w:rPr>
               <w:t>1.43</w:t>
             </w:r>
@@ -1305,7 +1297,7 @@
             </w:pPr>
             <w:r>
               <w:rPr>
-                <w:sz w:val="19"/>
+                <w:sz w:val="20"/>
               </w:rPr>
               <w:t>1.52</w:t>
             </w:r>
@@ -1320,9 +1312,9 @@
       <w:r>
         <w:rPr>
           <w:i/>
-          <w:sz w:val="18"/>
+          <w:sz w:val="20"/>
         </w:rPr>
-        <w:t>Table 2. Out-of-sample error for model 2.1, in goals. Hold-out = last 16 matches, fitted on the first 88.</w:t>
+        <w:t>Table 2. Out-of-sample error for model 2.1, in goals. Hold-out here is chronological: the last 16 matches, fitted on the first 88.</w:t>
       </w:r>
     </w:p>
     <w:p>
@@ -1333,7 +1325,7 @@
       <w:r>
         <w:drawing>
           <wp:inline distT="0" distB="0" distL="114300" distR="114300">
-            <wp:extent cx="6119495" cy="2069465"/>
+            <wp:extent cx="5201227" cy="1758481"/>
             <wp:effectExtent l="0" t="0" r="1905" b="13335"/>
             <wp:docPr id="1" name="Picture 1"/>
             <wp:cNvGraphicFramePr>
@@ -1357,7 +1349,7 @@
                   <pic:spPr>
                     <a:xfrm>
                       <a:off x="0" y="0"/>
-                      <a:ext cx="6120000" cy="2070000"/>
+                      <a:ext cx="5202000" cy="1759500"/>
                     </a:xfrm>
                     <a:prstGeom prst="rect">
                       <a:avLst/>
@@ -1378,13 +1370,14 @@
       <w:r>
         <w:rPr>
           <w:i/>
-          <w:sz w:val="18"/>
+          <w:sz w:val="20"/>
         </w:rPr>
         <w:t>Figure 1. Model 2.1. (a) Fitted model with 95% confidence and prediction bands. (b) Share of 2,000 random relabellings in which each term of the full model is significant. (c) Out-of-sample RMSE of the competing models.</w:t>
       </w:r>
     </w:p>
     <w:p>
       <w:pPr>
+        <w:keepNext/>
         <w:spacing w:before="200" w:after="40"/>
       </w:pPr>
       <w:r>
@@ -1397,45 +1390,46 @@
     </w:p>
     <w:p>
       <w:pPr>
-        <w:spacing w:after="80" w:before="0"/>
+        <w:spacing w:before="0" w:after="80"/>
         <w:rPr>
           <w:rFonts w:hint="default"/>
-          <w:i w:val="0"/>
           <w:sz w:val="20"/>
         </w:rPr>
       </w:pPr>
       <w:r>
         <w:rPr>
+          <w:rFonts w:hint="default"/>
           <w:sz w:val="20"/>
         </w:rPr>
-        <w:t>Exploratory analysis. The mean number of goals per team-match is 1.48, the variance is 1.94 and the zero rate is 26.4%. Correlating the eight variables with the response makes the ordering clear: squad value (+0.40), the team's own FIFA ranking (-0.37) and the opponent's ranking (+0.32) are the three strongest. Behind these come the opponent's goals conceded per game (+0.21) and the host advantage (+0.14). The team's own scoring form is weak (+0.10), and two variables are basically noise: the opponent's goals-for form (-0.06) and the knockout flag (-0.01).</w:t>
+        <w:t>Exploratory analysis. The mean and variance of goals per team-match are 1.48 and 1.94 respectively, and 26.4% of team-matches have zero goals. Correlating all eight variables with the response makes the ordering clear: squad value (+0.40), the team's own FIFA ranking (-0.37) and the opponent's ranking (+0.32) are the three strongest. The opponent's goals conceded per game (+0.21) and the host advantage (+0.14) follow after. The team's own scoring form is weak (+0.10), and two variables are nearly noise: the opponent's goals-for form (-0.06) and is_knockout (-0.01).</w:t>
       </w:r>
     </w:p>
     <w:p>
       <w:pPr>
-        <w:spacing w:after="80" w:before="0"/>
+        <w:spacing w:before="0" w:after="80"/>
         <w:rPr>
           <w:rFonts w:hint="default"/>
-          <w:i w:val="0"/>
           <w:sz w:val="20"/>
         </w:rPr>
       </w:pPr>
       <w:r>
         <w:rPr>
+          <w:rFonts w:hint="default"/>
           <w:sz w:val="20"/>
         </w:rPr>
-        <w:t>Modelling and optimisation. The full eight-variable OLS gives R2 = 0.306 and adjusted R2 = 0.278 (AIC 669.33). An exhaustive search over all 255 subsets confirmed what the correlations suggested: removing opp_gf_pg (p = 0.580) and is_knockout (p = 0.658) reduces AIC to 665.75 and improves 10-fold CV RMSE from 1.203 to 1.191. The retained variables do not cause damaging collinearity, as variance inflation factors remain under 3.03 throughout.</w:t>
+        <w:t>Modelling and optimisation. The full eight-variable OLS gives R2 = 0.306 and adjusted R2 = 0.278 (AIC 669.33). An exhaustive search on all 255 subsets confirmed what the correlations predicted: removal of opp_gf_pg (p = 0.580) and is_knockout (p = 0.658) resulted in an improved 10-fold CV RMSE and lower AIC (1.191 and 665.75, respectively). The retained variables are not causing damaging collinearity with variance inflation factors all under 3.03.</w:t>
       </w:r>
     </w:p>
     <w:p>
       <w:pPr>
-        <w:spacing w:after="80" w:before="0"/>
+        <w:spacing w:before="0" w:after="80"/>
       </w:pPr>
       <w:r>
         <w:rPr>
+          <w:rFonts w:hint="default"/>
           <w:sz w:val="20"/>
         </w:rPr>
-        <w:t>Final model.  goals_scored = -0.747 + 0.386 x team_log_value + 0.269 x opp_log_rank + 0.802 x is_host_home - 0.397 x team_gf_pg + 0.401 x opp_ga_pg - 0.226 x team_log_rank. Doubling a squad's value adds approximately 0.27 to the expected number of goals scored; being a host nation playing at home adds +0.80 goals. The diagnostics (Figure 2) show the count-data character of the response: the Breusch-Pagan test indicates mild heteroscedasticity (p = 0.0024) and the Jarque-Bera test rejects normal residuals (p &lt; 0.001, skewness 0.78), driven by the inflated number of zeros. Re-estimating with HC3 robust standard errors leaves squad value (p = 0.0007), opponent ranking (p = 0.0022) and host advantage (p = 0.0477) significant. Neither autocorrelation nor single outliers are responsible, as Durbin-Watson is 1.82 and the largest Cook's distance is 0.137.</w:t>
+        <w:t>Final model.  goals_scored = -0.747 + 0.386 x team_log_value + 0.269 x opp_log_rank + 0.802 x is_host_home - 0.397 x team_gf_pg + 0.401 x opp_ga_pg - 0.226 x team_log_rank. Doubling a squad's value increases the number of goals scored by about 0.27, and playing at home in your own country increases goals scored by +0.80. As displayed in the diagnostics (Figure 2) the response is count data: The Breusch-Pagan test suggests mild heteroscedasticity (p = 0.0024) and the Jarque-Bera test was also significant suggesting non-normal residuals (p &lt; 0.001, skewness 0.78) due to excessive zeros. After re-estimating with HC3 robust standard errors, squad value (p = 0.0007), host advantage (p = 0.0477), opponent ranking (p = 0.0022) and the team's own ranking (p = 0.0250) are still significant. It is not caused by autocorrelation as DW = 1.82 and the maximum Cook's distance is 0.137 and no single value is responsible.</w:t>
       </w:r>
     </w:p>
     <w:p>
@@ -1446,7 +1440,7 @@
       <w:r>
         <w:drawing>
           <wp:inline distT="0" distB="0" distL="114300" distR="114300">
-            <wp:extent cx="6119495" cy="1835785"/>
+            <wp:extent cx="5201227" cy="1520500"/>
             <wp:effectExtent l="0" t="0" r="1905" b="18415"/>
             <wp:docPr id="6" name="Picture 6"/>
             <wp:cNvGraphicFramePr>
@@ -1470,7 +1464,7 @@
                   <pic:spPr>
                     <a:xfrm>
                       <a:off x="0" y="0"/>
-                      <a:ext cx="6120000" cy="1836000"/>
+                      <a:ext cx="5202000" cy="1520642"/>
                     </a:xfrm>
                     <a:prstGeom prst="rect">
                       <a:avLst/>
@@ -1491,36 +1485,37 @@
       <w:r>
         <w:rPr>
           <w:i/>
-          <w:sz w:val="18"/>
+          <w:sz w:val="20"/>
         </w:rPr>
         <w:t>Figure 2. Model 2.2 residual diagnostics. (a) Predicted against actual goals. (b) Residuals against fitted values, showing the mild heteroscedasticity the Breusch-Pagan test detects. (c) Normal Q-Q plot: the departure in the lower tail is the 26.4% of team-matches that finish goalless, which is why robust standard errors are reported alongside the classical ones.</w:t>
       </w:r>
     </w:p>
     <w:p>
       <w:pPr>
-        <w:spacing w:after="80" w:before="0"/>
+        <w:spacing w:before="0" w:after="80"/>
         <w:rPr>
           <w:rFonts w:hint="default"/>
-          <w:i w:val="0"/>
           <w:sz w:val="20"/>
         </w:rPr>
       </w:pPr>
       <w:r>
         <w:rPr>
+          <w:rFonts w:hint="default"/>
           <w:sz w:val="20"/>
         </w:rPr>
-        <w:t>Competing algorithms. The same 80/20 split was used for six alternatives (Figure 3). No non-linear or ensemble method outperformed ordinary linear regression, and gradient boosting was not as good as predicting the mean of the training cases. The regularised linear models improved on OLS only a little, raising R2 from 0.175 to 0.196. With 208 rows and eight variables the flexible models overfit, so we recommend keeping linear regression, which is both the more interpretable and, in practice, the more accurate choice, with elastic net as a defensible alternative.</w:t>
+        <w:t>Competing algorithms. On the 80/20 random split (42 test rows) the full eight-variable model returns MAE 0.923, MSE 1.656, RMSE 1.287, normalised RMSE 0.184 and R2 0.175, against 1.070, 2.011, 1.418, 0.203 and -0.002 for the training-mean baseline. The six alternatives were evaluated back-to-back between each other on the same split (Figure 3). No non-linear or ensemble model did better than ordinary linear regression and on this split gradient boosting did not even beat predicting the average of the training cases. The regularised linear models barely did better than OLS (R2 was only slightly higher at 0.175 to 0.196). Repeated 10-fold cross validation (30 times) does not rely on the 42 test rows and gives exactly the same ordering: elastic-net regression, lasso regression, ridge regression and OLS regression within 0.004 of each other, with an average root mean square error of 1.184 to 1.187 (best to worst, with a standard error of 0.014); polynomial regression, random forest regression, gradient boosting regression and the mean of the training rows are worse: polynomial regression 1.233, random forest regression 1.269, gradient boosting regression 1.336 and the mean of the training rows 1.371. The flexible models overfit the data (208 rows, eight variables); linear regression is the most interpretable model, while, for practical purposes, it also happens to be the most accurate; elastic net is a defendable alternative.</w:t>
       </w:r>
     </w:p>
     <w:p>
       <w:pPr>
-        <w:spacing w:after="80" w:before="0"/>
+        <w:spacing w:before="0" w:after="80"/>
       </w:pPr>
       <w:r>
         <w:rPr>
+          <w:rFonts w:hint="default"/>
           <w:sz w:val="20"/>
         </w:rPr>
-        <w:t>Two further optimisations from the Week 9 practical were applied to both models. Z-score standardisation did not change them to four decimal places (RMSE 1.287 and 1.500 before and after), which is the expected result: rescaling a predictor rescales its coefficient and nothing else in ordinary least squares. A Yeo-Johnson transform of the predictors did help, lowering hold-out RMSE from 1.287 to 1.252 and raising R2 from 0.175 to 0.219 in model 2.2, and from 1.500 to 1.463 and 0.417 to 0.445 in model 2.1. The gain is less than three per cent and is bought with coefficients that no longer carry any direct football interpretation, so we report the untransformed models and record the transform as the available refinement.</w:t>
+        <w:t>Two further optimisations from the Week 9 practical were also applied to both models. Z-score standardisation left both unchanged to four decimal places (hold-out RMSE 1.287 and 1.500), as expected: the coefficient of a predictor is rescaled when the predictor itself is rescaled – nothing else. A Yeo-Johnson transform of the predictors did help, lowering hold-out RMSE from 1.287 to 1.252 and raising R2 from 0.175 to 0.219 in model 2.2, and from 1.500 to 1.463 and 0.417 to 0.445 in model 2.1. The gain is less than three per cent, and the transformed coefficients are no longer directly related to football, so the untransformed models are reported and the transform is recorded as an available option.</w:t>
       </w:r>
     </w:p>
     <w:p>
@@ -1531,7 +1526,7 @@
       <w:r>
         <w:drawing>
           <wp:inline distT="0" distB="0" distL="114300" distR="114300">
-            <wp:extent cx="6119495" cy="2443480"/>
+            <wp:extent cx="4160873" cy="1661231"/>
             <wp:effectExtent l="0" t="0" r="1905" b="20320"/>
             <wp:docPr id="4" name="Picture 4"/>
             <wp:cNvGraphicFramePr>
@@ -1555,7 +1550,7 @@
                   <pic:spPr>
                     <a:xfrm>
                       <a:off x="0" y="0"/>
-                      <a:ext cx="6120000" cy="2443741"/>
+                      <a:ext cx="4161600" cy="1661744"/>
                     </a:xfrm>
                     <a:prstGeom prst="rect">
                       <a:avLst/>
@@ -1576,13 +1571,14 @@
       <w:r>
         <w:rPr>
           <w:i/>
-          <w:sz w:val="18"/>
+          <w:sz w:val="20"/>
         </w:rPr>
         <w:t>Figure 3. Model 2.2 against six competing regression algorithms on the same 80/20 hold-out. Only the regularised linear models improve on ordinary least squares, and marginally; gradient boosting is worse than predicting the training mean.</w:t>
       </w:r>
     </w:p>
     <w:p>
       <w:pPr>
+        <w:keepNext/>
         <w:spacing w:before="200" w:after="40"/>
       </w:pPr>
       <w:r>
@@ -1595,48 +1591,49 @@
     </w:p>
     <w:p>
       <w:pPr>
-        <w:spacing w:after="80" w:before="0"/>
+        <w:spacing w:before="0" w:after="80"/>
         <w:rPr>
           <w:rFonts w:hint="default"/>
-          <w:i w:val="0"/>
           <w:sz w:val="20"/>
         </w:rPr>
       </w:pPr>
       <w:r>
         <w:rPr>
+          <w:rFonts w:hint="default"/>
           <w:sz w:val="20"/>
         </w:rPr>
-        <w:t>Both models concur about what matters. Both are dominated by pre-tournament strength, as measured by FIFA ranking and squad value, with playing at home as a host nation the only other variable that earns its place in either. They also agree about what does not matter, and that part is the more noteworthy. Model 2.1 finds that in-tournament form has a partial correlation of -0.06 once strength is controlled for, while model 2.2 finds the same variables weakly correlated (+0.10) and carrying a counter-intuitive negative coefficient. Read on its own, that minus sign implies a tactical story. Read together with model 2.1, the simpler explanation is collinearity against ranking and value: form in a seven-match tournament is primarily a noisy re-statement of the strength the teams already had (Figure 4).</w:t>
+        <w:t>Both models agree on what matters. The two are actually based on pre-tournament strength – according to FIFA ranking and squad value – with playing at home as a host nation being the only other factor to make the cut in both. They also seem to be in universal consensus on what doesn't matter, and that is much the more interesting part. Actually, the partial correlation of in-tournament form is -0.06 in model 2.1 once strength is controlled for, while in model 2.2 the team's own scoring form is only weakly correlated (+0.10) and gets a counter-intuitive negative coefficient. If read alone, the minus sign signals a story that is going to involve tactics. Read together with model 2.1, the simpler explanation is collinearity against ranking and value: form over at most eight matches per team is mostly a re-statement of the strength a team already had (Figure 4).</w:t>
       </w:r>
     </w:p>
     <w:p>
       <w:pPr>
-        <w:spacing w:after="80" w:before="0"/>
+        <w:spacing w:before="0" w:after="80"/>
         <w:rPr>
           <w:rFonts w:hint="default"/>
-          <w:i w:val="0"/>
           <w:sz w:val="20"/>
         </w:rPr>
       </w:pPr>
       <w:r>
         <w:rPr>
+          <w:rFonts w:hint="default"/>
           <w:sz w:val="20"/>
         </w:rPr>
-        <w:t>Under half the variance is explained by both models, and under a fifth by model 2.2. The 95% prediction interval for model 2.1 is plus or minus 2.9 goals, so it ranks fixtures far better than it forecasts them. Three limitations bound the work. Seven matches per team is a short history, which is why the form variables had to be shrunk towards a prior and why the flexible models overfit. The host effect rests on only 13 matches. And the methodological caveat extends beyond this dataset: random cross-validation rated the full eight-variable model of 2.1 as adequate, and only chronological validation exposed that it had learned a scheduling artefact rather than football. Where observations are ordered in time, random folds are not sufficient.</w:t>
+        <w:t>Both models account for less than 50 per cent of the variance and model 2.2 accounts for less than 20 per cent of out-of-sample variance. The 95% prediction interval for model 2.1 is ± 2.9 goals, which means that it ranks fixtures a lot better than it forecasts. The work had three restrictions. It's not a long history: at most eight matches per team (4.3 on average), so the form variables had to be shrunk towards a prior, and flexible models overfitted. The host effect is based on a small number of matches (n = 13). But the methodological warning doesn't apply just to this data; random cross-validation found that the entire eight-variable model of 2.1 was adequate; only chronological validation revealed that it had learned a scheduling artefact rather than football. If the observations have a temporal dependence, then the random folds are not enough.</w:t>
       </w:r>
     </w:p>
     <w:p>
       <w:pPr>
-        <w:spacing w:after="80" w:before="0"/>
+        <w:spacing w:before="0" w:after="80"/>
       </w:pPr>
+      <w:r>
+        <w:rPr>
+          <w:rFonts w:hint="default"/>
+          <w:sz w:val="20"/>
+        </w:rPr>
+        <w:t>Prediction: Recommended is the symmetric two term model for goal difference and the six-variable linear regression for goals scored, where its negative form coefficient is explained by collinearity, not by a causal effect. The lesson is a bit more blunt in the case of interpreting games of the World Cup: most of what decides a World Cup game is settled before the tournament starts, and the rest is largely not forecastable from the data available beforehand.</w:t>
+      </w:r>
       <w:bookmarkStart w:id="0" w:name="_GoBack"/>
       <w:bookmarkEnd w:id="0"/>
-      <w:r>
-        <w:rPr>
-          <w:sz w:val="20"/>
-        </w:rPr>
-        <w:t>For prediction we recommend the symmetric two-term model for goal difference and the six-variable linear regression for goals scored. For interpretation the lesson is blunter: most of what decides a World Cup match is settled before the tournament starts, and the rest is largely not forecastable from the data available beforehand.</w:t>
-      </w:r>
     </w:p>
     <w:p>
       <w:pPr>
@@ -1646,7 +1643,7 @@
       <w:r>
         <w:drawing>
           <wp:inline distT="0" distB="0" distL="114300" distR="114300">
-            <wp:extent cx="6119495" cy="2349500"/>
+            <wp:extent cx="4895548" cy="1879600"/>
             <wp:effectExtent l="0" t="0" r="1905" b="12700"/>
             <wp:docPr id="5" name="Picture 5"/>
             <wp:cNvGraphicFramePr>
@@ -1670,7 +1667,7 @@
                   <pic:spPr>
                     <a:xfrm>
                       <a:off x="0" y="0"/>
-                      <a:ext cx="6120000" cy="2349884"/>
+                      <a:ext cx="4896000" cy="1879908"/>
                     </a:xfrm>
                     <a:prstGeom prst="rect">
                       <a:avLst/>
@@ -1691,9 +1688,9 @@
       <w:r>
         <w:rPr>
           <w:i/>
-          <w:sz w:val="18"/>
+          <w:sz w:val="20"/>
         </w:rPr>
-        <w:t>Figure 4. Why both models reach the same verdict on form. (a) In model 2.2 the four variables measuring pre-tournament strength and venue outrank the three form variables, two of which sit on zero. (b) In model 2.1 the raw correlation of form with goal difference (filled) collapses to the chance level once strength is controlled for (open): form is largely a restatement of strength the teams already had.</w:t>
+        <w:t>Figure 4. Why both models reach the same verdict on form. (a) In model 2.2 the three pre-tournament strength variables are the strongest correlates, and two of the three form variables sit near zero. (b) In model 2.1 the raw correlation of form with goal difference (filled) collapses to the chance level once strength is controlled for (open): form is largely a restatement of strength the teams already had.</w:t>
       </w:r>
     </w:p>
     <w:sectPr>

</xml_diff>